<commit_message>
Update LPB, add Topic_04 and Topic_05
</commit_message>
<xml_diff>
--- a/TP-KB-251-Igor-Kharcenko.docx
+++ b/TP-KB-251-Igor-Kharcenko.docx
@@ -6831,173 +6831,247 @@
     </w:p>
     <w:p>
       <w:pPr>
-        <w:pStyle w:val="Normal"/>
-      </w:pPr>
-      <w:r>
-        <w:rPr>
-          <w:noProof w:val="0"/>
-          <w:lang w:val="uk-UA"/>
-        </w:rPr>
-        <w:t>Для виконання завдання було написано програму мовою Python, яка визначає позицію для вставки нового елемента у відсортований список чисел без порушення порядку сортування.</w:t>
-      </w:r>
-    </w:p>
-    <w:p>
-      <w:pPr>
-        <w:pStyle w:val="Normal"/>
-      </w:pPr>
-      <w:r>
-        <w:rPr>
-          <w:noProof w:val="0"/>
-          <w:lang w:val="uk-UA"/>
-        </w:rPr>
-        <w:t xml:space="preserve">Спочатку було створено список </w:t>
-      </w:r>
-      <w:r>
-        <w:rPr>
-          <w:noProof w:val="0"/>
-          <w:lang w:val="uk-UA"/>
-        </w:rPr>
-        <w:t>list = [1, 5, 10, 15, 20]</w:t>
-      </w:r>
-      <w:r>
-        <w:rPr>
-          <w:noProof w:val="0"/>
-          <w:lang w:val="uk-UA"/>
-        </w:rPr>
-        <w:t xml:space="preserve">, елементи якого розташовані за зростанням. Для пошуку необхідної позиції було розроблено функцію </w:t>
-      </w:r>
-      <w:r>
-        <w:rPr>
-          <w:noProof w:val="0"/>
-          <w:lang w:val="uk-UA"/>
-        </w:rPr>
-        <w:t>FindingPosition(list, value)</w:t>
-      </w:r>
-      <w:r>
-        <w:rPr>
-          <w:noProof w:val="0"/>
-          <w:lang w:val="uk-UA"/>
-        </w:rPr>
-        <w:t>, яка приймає два параметри: список чисел та значення нового елемента.</w:t>
-      </w:r>
-    </w:p>
-    <w:p>
-      <w:pPr>
-        <w:pStyle w:val="Normal"/>
-      </w:pPr>
-      <w:r>
-        <w:rPr>
-          <w:noProof w:val="0"/>
-          <w:lang w:val="uk-UA"/>
-        </w:rPr>
-        <w:t xml:space="preserve">У функції створено змінну </w:t>
-      </w:r>
-      <w:r>
-        <w:rPr>
-          <w:noProof w:val="0"/>
-          <w:lang w:val="uk-UA"/>
-        </w:rPr>
-        <w:t>index</w:t>
-      </w:r>
-      <w:r>
-        <w:rPr>
-          <w:noProof w:val="0"/>
-          <w:lang w:val="uk-UA"/>
-        </w:rPr>
-        <w:t xml:space="preserve">, початкове значення якої дорівнює 0. За допомогою циклу </w:t>
-      </w:r>
-      <w:r>
-        <w:rPr>
-          <w:noProof w:val="0"/>
-          <w:lang w:val="uk-UA"/>
-        </w:rPr>
-        <w:t>for</w:t>
-      </w:r>
-      <w:r>
-        <w:rPr>
-          <w:noProof w:val="0"/>
-          <w:lang w:val="uk-UA"/>
-        </w:rPr>
-        <w:t xml:space="preserve"> відбувається послідовний перебір елементів списку. Якщо поточний елемент менший за введене число, значення </w:t>
-      </w:r>
-      <w:r>
-        <w:rPr>
-          <w:noProof w:val="0"/>
-          <w:lang w:val="uk-UA"/>
-        </w:rPr>
-        <w:t>index</w:t>
-      </w:r>
-      <w:r>
-        <w:rPr>
-          <w:noProof w:val="0"/>
-          <w:lang w:val="uk-UA"/>
-        </w:rPr>
-        <w:t xml:space="preserve"> збільшується на одиницю. Якщо умова не виконується, функція повертає поточний індекс, який відповідає позиції для вставки нового елемента.</w:t>
-      </w:r>
-    </w:p>
-    <w:p>
-      <w:pPr>
-        <w:pStyle w:val="Normal"/>
-      </w:pPr>
-      <w:r>
-        <w:rPr>
-          <w:noProof w:val="0"/>
-          <w:lang w:val="uk-UA"/>
-        </w:rPr>
-        <w:t xml:space="preserve">Далі за допомогою функції </w:t>
-      </w:r>
-      <w:r>
-        <w:rPr>
-          <w:noProof w:val="0"/>
+        <w:spacing w:before="240" w:beforeAutospacing="off" w:after="240" w:afterAutospacing="off" w:line="360" w:lineRule="auto"/>
+        <w:rPr>
+          <w:rFonts w:ascii="Times New Roman" w:hAnsi="Times New Roman" w:eastAsia="Times New Roman" w:cs="Times New Roman"/>
+          <w:noProof w:val="0"/>
+          <w:sz w:val="28"/>
+          <w:szCs w:val="28"/>
+          <w:lang w:val="uk-UA"/>
+        </w:rPr>
+      </w:pPr>
+      <w:r>
+        <w:rPr>
+          <w:rFonts w:ascii="Times New Roman" w:hAnsi="Times New Roman" w:eastAsia="Times New Roman" w:cs="Times New Roman"/>
+          <w:noProof w:val="0"/>
+          <w:sz w:val="28"/>
+          <w:szCs w:val="28"/>
+          <w:lang w:val="uk-UA"/>
+        </w:rPr>
+        <w:t xml:space="preserve">Спочатку було створено функцію </w:t>
+      </w:r>
+      <w:r>
+        <w:rPr>
+          <w:rFonts w:ascii="Times New Roman" w:hAnsi="Times New Roman" w:eastAsia="Times New Roman" w:cs="Times New Roman"/>
+          <w:noProof w:val="0"/>
+          <w:sz w:val="28"/>
+          <w:szCs w:val="28"/>
+          <w:lang w:val="uk-UA"/>
+        </w:rPr>
+        <w:t>insert()</w:t>
+      </w:r>
+      <w:r>
+        <w:rPr>
+          <w:rFonts w:ascii="Times New Roman" w:hAnsi="Times New Roman" w:eastAsia="Times New Roman" w:cs="Times New Roman"/>
+          <w:noProof w:val="0"/>
+          <w:sz w:val="28"/>
+          <w:szCs w:val="28"/>
+          <w:lang w:val="uk-UA"/>
+        </w:rPr>
+        <w:t xml:space="preserve">, яка приймає список та нове значення як параметри. Початковий список уже є відсортованим і містить значення </w:t>
+      </w:r>
+      <w:r>
+        <w:rPr>
+          <w:rFonts w:ascii="Times New Roman" w:hAnsi="Times New Roman" w:eastAsia="Times New Roman" w:cs="Times New Roman"/>
+          <w:noProof w:val="0"/>
+          <w:sz w:val="28"/>
+          <w:szCs w:val="28"/>
+          <w:lang w:val="uk-UA"/>
+        </w:rPr>
+        <w:t>1, 5, 10, 15, 20</w:t>
+      </w:r>
+      <w:r>
+        <w:rPr>
+          <w:rFonts w:ascii="Times New Roman" w:hAnsi="Times New Roman" w:eastAsia="Times New Roman" w:cs="Times New Roman"/>
+          <w:noProof w:val="0"/>
+          <w:sz w:val="28"/>
+          <w:szCs w:val="28"/>
+          <w:lang w:val="uk-UA"/>
+        </w:rPr>
+        <w:t>.</w:t>
+      </w:r>
+    </w:p>
+    <w:p>
+      <w:pPr>
+        <w:spacing w:before="240" w:beforeAutospacing="off" w:after="240" w:afterAutospacing="off" w:line="360" w:lineRule="auto"/>
+        <w:rPr>
+          <w:rFonts w:ascii="Times New Roman" w:hAnsi="Times New Roman" w:eastAsia="Times New Roman" w:cs="Times New Roman"/>
+          <w:noProof w:val="0"/>
+          <w:sz w:val="28"/>
+          <w:szCs w:val="28"/>
+          <w:lang w:val="uk-UA"/>
+        </w:rPr>
+      </w:pPr>
+      <w:r>
+        <w:rPr>
+          <w:rFonts w:ascii="Times New Roman" w:hAnsi="Times New Roman" w:eastAsia="Times New Roman" w:cs="Times New Roman"/>
+          <w:noProof w:val="0"/>
+          <w:sz w:val="28"/>
+          <w:szCs w:val="28"/>
+          <w:lang w:val="uk-UA"/>
+        </w:rPr>
+        <w:t xml:space="preserve">Всередині функції за допомогою </w:t>
+      </w:r>
+      <w:r>
+        <w:rPr>
+          <w:rFonts w:ascii="Times New Roman" w:hAnsi="Times New Roman" w:eastAsia="Times New Roman" w:cs="Times New Roman"/>
+          <w:noProof w:val="0"/>
+          <w:sz w:val="28"/>
+          <w:szCs w:val="28"/>
+          <w:lang w:val="uk-UA"/>
+        </w:rPr>
+        <w:t>append()</w:t>
+      </w:r>
+      <w:r>
+        <w:rPr>
+          <w:rFonts w:ascii="Times New Roman" w:hAnsi="Times New Roman" w:eastAsia="Times New Roman" w:cs="Times New Roman"/>
+          <w:noProof w:val="0"/>
+          <w:sz w:val="28"/>
+          <w:szCs w:val="28"/>
+          <w:lang w:val="uk-UA"/>
+        </w:rPr>
+        <w:t xml:space="preserve"> нове значення додається до списку. Після цього функція </w:t>
+      </w:r>
+      <w:r>
+        <w:rPr>
+          <w:rFonts w:ascii="Times New Roman" w:hAnsi="Times New Roman" w:eastAsia="Times New Roman" w:cs="Times New Roman"/>
+          <w:noProof w:val="0"/>
+          <w:sz w:val="28"/>
+          <w:szCs w:val="28"/>
+          <w:lang w:val="uk-UA"/>
+        </w:rPr>
+        <w:t>sort()</w:t>
+      </w:r>
+      <w:r>
+        <w:rPr>
+          <w:rFonts w:ascii="Times New Roman" w:hAnsi="Times New Roman" w:eastAsia="Times New Roman" w:cs="Times New Roman"/>
+          <w:noProof w:val="0"/>
+          <w:sz w:val="28"/>
+          <w:szCs w:val="28"/>
+          <w:lang w:val="uk-UA"/>
+        </w:rPr>
+        <w:t xml:space="preserve"> сортує список за зростанням.</w:t>
+      </w:r>
+    </w:p>
+    <w:p>
+      <w:pPr>
+        <w:spacing w:before="240" w:beforeAutospacing="off" w:after="240" w:afterAutospacing="off" w:line="360" w:lineRule="auto"/>
+        <w:rPr>
+          <w:rFonts w:ascii="Times New Roman" w:hAnsi="Times New Roman" w:eastAsia="Times New Roman" w:cs="Times New Roman"/>
+          <w:noProof w:val="0"/>
+          <w:sz w:val="28"/>
+          <w:szCs w:val="28"/>
+          <w:lang w:val="uk-UA"/>
+        </w:rPr>
+      </w:pPr>
+      <w:r>
+        <w:rPr>
+          <w:rFonts w:ascii="Times New Roman" w:hAnsi="Times New Roman" w:eastAsia="Times New Roman" w:cs="Times New Roman"/>
+          <w:noProof w:val="0"/>
+          <w:sz w:val="28"/>
+          <w:szCs w:val="28"/>
+          <w:lang w:val="uk-UA"/>
+        </w:rPr>
+        <w:t xml:space="preserve">Для визначення позиції доданого елемента використовується функція </w:t>
+      </w:r>
+      <w:r>
+        <w:rPr>
+          <w:rFonts w:ascii="Times New Roman" w:hAnsi="Times New Roman" w:eastAsia="Times New Roman" w:cs="Times New Roman"/>
+          <w:noProof w:val="0"/>
+          <w:sz w:val="28"/>
+          <w:szCs w:val="28"/>
+          <w:lang w:val="uk-UA"/>
+        </w:rPr>
+        <w:t>index()</w:t>
+      </w:r>
+      <w:r>
+        <w:rPr>
+          <w:rFonts w:ascii="Times New Roman" w:hAnsi="Times New Roman" w:eastAsia="Times New Roman" w:cs="Times New Roman"/>
+          <w:noProof w:val="0"/>
+          <w:sz w:val="28"/>
+          <w:szCs w:val="28"/>
+          <w:lang w:val="uk-UA"/>
+        </w:rPr>
+        <w:t xml:space="preserve">, яка знаходить індекс заданого значення у списку. Отриманий індекс повертається з функції за допомогою </w:t>
+      </w:r>
+      <w:r>
+        <w:rPr>
+          <w:rFonts w:ascii="Times New Roman" w:hAnsi="Times New Roman" w:eastAsia="Times New Roman" w:cs="Times New Roman"/>
+          <w:noProof w:val="0"/>
+          <w:sz w:val="28"/>
+          <w:szCs w:val="28"/>
+          <w:lang w:val="uk-UA"/>
+        </w:rPr>
+        <w:t>return</w:t>
+      </w:r>
+      <w:r>
+        <w:rPr>
+          <w:rFonts w:ascii="Times New Roman" w:hAnsi="Times New Roman" w:eastAsia="Times New Roman" w:cs="Times New Roman"/>
+          <w:noProof w:val="0"/>
+          <w:sz w:val="28"/>
+          <w:szCs w:val="28"/>
+          <w:lang w:val="uk-UA"/>
+        </w:rPr>
+        <w:t>.</w:t>
+      </w:r>
+    </w:p>
+    <w:p>
+      <w:pPr>
+        <w:spacing w:before="240" w:beforeAutospacing="off" w:after="240" w:afterAutospacing="off" w:line="360" w:lineRule="auto"/>
+        <w:rPr>
+          <w:rFonts w:ascii="Times New Roman" w:hAnsi="Times New Roman" w:eastAsia="Times New Roman" w:cs="Times New Roman"/>
+          <w:noProof w:val="0"/>
+          <w:sz w:val="28"/>
+          <w:szCs w:val="28"/>
+          <w:lang w:val="uk-UA"/>
+        </w:rPr>
+      </w:pPr>
+      <w:r>
+        <w:rPr>
+          <w:rFonts w:ascii="Times New Roman" w:hAnsi="Times New Roman" w:eastAsia="Times New Roman" w:cs="Times New Roman"/>
+          <w:noProof w:val="0"/>
+          <w:sz w:val="28"/>
+          <w:szCs w:val="28"/>
+          <w:lang w:val="uk-UA"/>
+        </w:rPr>
+        <w:t xml:space="preserve">Після створення списку користувач вводить нове число за допомогою </w:t>
+      </w:r>
+      <w:r>
+        <w:rPr>
+          <w:rFonts w:ascii="Times New Roman" w:hAnsi="Times New Roman" w:eastAsia="Times New Roman" w:cs="Times New Roman"/>
+          <w:noProof w:val="0"/>
+          <w:sz w:val="28"/>
+          <w:szCs w:val="28"/>
           <w:lang w:val="uk-UA"/>
         </w:rPr>
         <w:t>input()</w:t>
       </w:r>
       <w:r>
         <w:rPr>
-          <w:noProof w:val="0"/>
-          <w:lang w:val="uk-UA"/>
-        </w:rPr>
-        <w:t xml:space="preserve"> користувач вводить число, яке потрібно вставити до списку. Введене значення перетворюється на ціле число за допомогою </w:t>
-      </w:r>
-      <w:r>
-        <w:rPr>
-          <w:noProof w:val="0"/>
+          <w:rFonts w:ascii="Times New Roman" w:hAnsi="Times New Roman" w:eastAsia="Times New Roman" w:cs="Times New Roman"/>
+          <w:noProof w:val="0"/>
+          <w:sz w:val="28"/>
+          <w:szCs w:val="28"/>
+          <w:lang w:val="uk-UA"/>
+        </w:rPr>
+        <w:t xml:space="preserve">. Введене значення перетворюється у ціле число за допомогою </w:t>
+      </w:r>
+      <w:r>
+        <w:rPr>
+          <w:rFonts w:ascii="Times New Roman" w:hAnsi="Times New Roman" w:eastAsia="Times New Roman" w:cs="Times New Roman"/>
+          <w:noProof w:val="0"/>
+          <w:sz w:val="28"/>
+          <w:szCs w:val="28"/>
           <w:lang w:val="uk-UA"/>
         </w:rPr>
         <w:t>int()</w:t>
       </w:r>
       <w:r>
         <w:rPr>
-          <w:noProof w:val="0"/>
-          <w:lang w:val="uk-UA"/>
-        </w:rPr>
-        <w:t xml:space="preserve">. Після цього викликається функція </w:t>
-      </w:r>
-      <w:r>
-        <w:rPr>
-          <w:noProof w:val="0"/>
-          <w:lang w:val="uk-UA"/>
-        </w:rPr>
-        <w:t>FindingPosition()</w:t>
-      </w:r>
-      <w:r>
-        <w:rPr>
-          <w:noProof w:val="0"/>
-          <w:lang w:val="uk-UA"/>
-        </w:rPr>
-        <w:t xml:space="preserve">, а знайдений індекс виводиться на екран за допомогою </w:t>
-      </w:r>
-      <w:r>
-        <w:rPr>
-          <w:noProof w:val="0"/>
-          <w:lang w:val="uk-UA"/>
-        </w:rPr>
-        <w:t>print()</w:t>
-      </w:r>
-      <w:r>
-        <w:rPr>
-          <w:noProof w:val="0"/>
+          <w:rFonts w:ascii="Times New Roman" w:hAnsi="Times New Roman" w:eastAsia="Times New Roman" w:cs="Times New Roman"/>
+          <w:noProof w:val="0"/>
+          <w:sz w:val="28"/>
+          <w:szCs w:val="28"/>
           <w:lang w:val="uk-UA"/>
         </w:rPr>
         <w:t>.</w:t>
@@ -7005,82 +7079,54 @@
     </w:p>
     <w:p>
       <w:pPr>
-        <w:pStyle w:val="Normal"/>
-      </w:pPr>
-      <w:r>
-        <w:rPr>
-          <w:noProof w:val="0"/>
-          <w:lang w:val="uk-UA"/>
-        </w:rPr>
-        <w:t xml:space="preserve">Наприклад, якщо користувач введе число </w:t>
-      </w:r>
-      <w:r>
-        <w:rPr>
-          <w:noProof w:val="0"/>
-          <w:lang w:val="uk-UA"/>
-        </w:rPr>
-        <w:t>12</w:t>
-      </w:r>
-      <w:r>
-        <w:rPr>
-          <w:noProof w:val="0"/>
-          <w:lang w:val="uk-UA"/>
-        </w:rPr>
-        <w:t xml:space="preserve">, програма поверне індекс </w:t>
-      </w:r>
-      <w:r>
-        <w:rPr>
-          <w:noProof w:val="0"/>
-          <w:lang w:val="uk-UA"/>
-        </w:rPr>
-        <w:t>3</w:t>
-      </w:r>
-      <w:r>
-        <w:rPr>
-          <w:noProof w:val="0"/>
-          <w:lang w:val="uk-UA"/>
-        </w:rPr>
-        <w:t xml:space="preserve">, оскільки це число повинно розташовуватися між елементами </w:t>
-      </w:r>
-      <w:r>
-        <w:rPr>
-          <w:noProof w:val="0"/>
-          <w:lang w:val="uk-UA"/>
-        </w:rPr>
-        <w:t>10</w:t>
-      </w:r>
-      <w:r>
-        <w:rPr>
-          <w:noProof w:val="0"/>
-          <w:lang w:val="uk-UA"/>
-        </w:rPr>
-        <w:t xml:space="preserve"> та </w:t>
-      </w:r>
-      <w:r>
-        <w:rPr>
-          <w:noProof w:val="0"/>
-          <w:lang w:val="uk-UA"/>
-        </w:rPr>
-        <w:t>15</w:t>
-      </w:r>
-      <w:r>
-        <w:rPr>
-          <w:noProof w:val="0"/>
-          <w:lang w:val="uk-UA"/>
-        </w:rPr>
-        <w:t>.</w:t>
-      </w:r>
-    </w:p>
-    <w:p>
-      <w:pPr>
-        <w:pStyle w:val="Normal"/>
-      </w:pPr>
-      <w:r>
-        <w:rPr>
-          <w:noProof w:val="0"/>
-          <w:lang w:val="uk-UA"/>
-        </w:rPr>
-        <w:t>Таким чином, було реалізовано функцію пошуку позиції для вставки нового елемента у відсортований список, яка дозволяє визначити необхідний індекс без зміни початкового списку.</w:t>
+        <w:spacing w:before="240" w:beforeAutospacing="off" w:after="240" w:afterAutospacing="off" w:line="360" w:lineRule="auto"/>
+        <w:rPr>
+          <w:rFonts w:ascii="Times New Roman" w:hAnsi="Times New Roman" w:eastAsia="Times New Roman" w:cs="Times New Roman"/>
+          <w:noProof w:val="0"/>
+          <w:sz w:val="28"/>
+          <w:szCs w:val="28"/>
+          <w:lang w:val="uk-UA"/>
+        </w:rPr>
+      </w:pPr>
+      <w:r>
+        <w:rPr>
+          <w:rFonts w:ascii="Times New Roman" w:hAnsi="Times New Roman" w:eastAsia="Times New Roman" w:cs="Times New Roman"/>
+          <w:noProof w:val="0"/>
+          <w:sz w:val="28"/>
+          <w:szCs w:val="28"/>
+          <w:lang w:val="uk-UA"/>
+        </w:rPr>
+        <w:t xml:space="preserve">Після цього викликається функція </w:t>
+      </w:r>
+      <w:r>
+        <w:rPr>
+          <w:rFonts w:ascii="Times New Roman" w:hAnsi="Times New Roman" w:eastAsia="Times New Roman" w:cs="Times New Roman"/>
+          <w:noProof w:val="0"/>
+          <w:sz w:val="28"/>
+          <w:szCs w:val="28"/>
+          <w:lang w:val="uk-UA"/>
+        </w:rPr>
+        <w:t>insert</w:t>
+      </w:r>
+      <w:r>
+        <w:rPr>
+          <w:rFonts w:ascii="Times New Roman" w:hAnsi="Times New Roman" w:eastAsia="Times New Roman" w:cs="Times New Roman"/>
+          <w:noProof w:val="0"/>
+          <w:sz w:val="28"/>
+          <w:szCs w:val="28"/>
+          <w:lang w:val="uk-UA"/>
+        </w:rPr>
+        <w:t>()</w:t>
+      </w:r>
+      <w:r>
+        <w:rPr>
+          <w:rFonts w:ascii="Times New Roman" w:hAnsi="Times New Roman" w:eastAsia="Times New Roman" w:cs="Times New Roman"/>
+          <w:noProof w:val="0"/>
+          <w:sz w:val="28"/>
+          <w:szCs w:val="28"/>
+          <w:lang w:val="uk-UA"/>
+        </w:rPr>
+        <w:t>, яка додає новий елемент, сортує список та визначає його індекс. Отримана позиція нового елемента виводиться на екран.</w:t>
       </w:r>
     </w:p>
     <w:p>
@@ -7096,10 +7142,10 @@
       </w:r>
       <w:r>
         <w:drawing>
-          <wp:inline wp14:editId="51893D3E" wp14:anchorId="54E7FEB3">
-            <wp:extent cx="5943600" cy="3286125"/>
+          <wp:inline wp14:editId="6305FF88" wp14:anchorId="2CA5E0DE">
+            <wp:extent cx="5943600" cy="3305175"/>
             <wp:effectExtent l="0" t="0" r="0" b="0"/>
-            <wp:docPr id="721621538" name="drawing"/>
+            <wp:docPr id="115955418" name="drawing"/>
             <wp:cNvGraphicFramePr>
               <a:graphicFrameLocks noChangeAspect="1"/>
             </wp:cNvGraphicFramePr>
@@ -7107,11 +7153,11 @@
               <a:graphicData xmlns:a="http://schemas.openxmlformats.org/drawingml/2006/main" uri="http://schemas.openxmlformats.org/drawingml/2006/picture">
                 <pic:pic xmlns:pic="http://schemas.openxmlformats.org/drawingml/2006/picture">
                   <pic:nvPicPr>
-                    <pic:cNvPr id="721621538" name="Picture 721621538"/>
+                    <pic:cNvPr id="115955418" name="Picture 115955418"/>
                     <pic:cNvPicPr/>
                   </pic:nvPicPr>
                   <pic:blipFill>
-                    <a:blip xmlns:r="http://schemas.openxmlformats.org/officeDocument/2006/relationships" r:embed="rId1944325507">
+                    <a:blip xmlns:r="http://schemas.openxmlformats.org/officeDocument/2006/relationships" r:embed="rId736187099">
                       <a:extLst>
                         <a:ext uri="{28A0092B-C50C-407E-A947-70E740481C1C}">
                           <a14:useLocalDpi xmlns:a14="http://schemas.microsoft.com/office/drawing/2010/main"/>
@@ -7125,7 +7171,7 @@
                   <pic:spPr>
                     <a:xfrm>
                       <a:off x="0" y="0"/>
-                      <a:ext cx="5943600" cy="3286125"/>
+                      <a:ext cx="5943600" cy="3305175"/>
                     </a:xfrm>
                     <a:prstGeom prst="rect">
                       <a:avLst/>
@@ -7156,15 +7202,12 @@
         </w:rPr>
         <w:t>:</w:t>
       </w:r>
-      <w:hyperlink r:id="Rd925ca80bd1841cb">
-        <w:r>
-          <w:rPr>
-            <w:rStyle w:val="Hyperlink"/>
-            <w:lang w:val="ru-RU"/>
-          </w:rPr>
-          <w:t xml:space="preserve"> https://github.com/igor231083-cmd/TP-KB-251-Igor-Kharcenko/blob/main/Topic_03/test04.py</w:t>
-        </w:r>
-      </w:hyperlink>
+      <w:r>
+        <w:rPr>
+          <w:lang w:val="ru-RU"/>
+        </w:rPr>
+        <w:t xml:space="preserve"> https://github.com/igor231083-cmd/TP-KB-251-Igor-Kharcenko/blob/main/Topic_03/test04.py</w:t>
+      </w:r>
     </w:p>
     <w:p>
       <w:pPr>
@@ -7189,10 +7232,10 @@
       </w:r>
       <w:r>
         <w:drawing>
-          <wp:inline wp14:editId="155702FE" wp14:anchorId="6E6AF097">
-            <wp:extent cx="5943600" cy="4362450"/>
+          <wp:inline wp14:editId="3604E327" wp14:anchorId="0EF40354">
+            <wp:extent cx="5430008" cy="4420217"/>
             <wp:effectExtent l="0" t="0" r="0" b="0"/>
-            <wp:docPr id="1030446530" name="drawing"/>
+            <wp:docPr id="59179070" name="drawing"/>
             <wp:cNvGraphicFramePr>
               <a:graphicFrameLocks noChangeAspect="1"/>
             </wp:cNvGraphicFramePr>
@@ -7200,11 +7243,11 @@
               <a:graphicData xmlns:a="http://schemas.openxmlformats.org/drawingml/2006/main" uri="http://schemas.openxmlformats.org/drawingml/2006/picture">
                 <pic:pic xmlns:pic="http://schemas.openxmlformats.org/drawingml/2006/picture">
                   <pic:nvPicPr>
-                    <pic:cNvPr id="1030446530" name="Picture 1030446530"/>
+                    <pic:cNvPr id="59179070" name="Picture 59179070"/>
                     <pic:cNvPicPr/>
                   </pic:nvPicPr>
                   <pic:blipFill>
-                    <a:blip xmlns:r="http://schemas.openxmlformats.org/officeDocument/2006/relationships" r:embed="rId1387507347">
+                    <a:blip xmlns:r="http://schemas.openxmlformats.org/officeDocument/2006/relationships" r:embed="rId1362085065">
                       <a:extLst>
                         <a:ext uri="{28A0092B-C50C-407E-A947-70E740481C1C}">
                           <a14:useLocalDpi xmlns:a14="http://schemas.microsoft.com/office/drawing/2010/main"/>
@@ -7218,7 +7261,7 @@
                   <pic:spPr>
                     <a:xfrm>
                       <a:off x="0" y="0"/>
-                      <a:ext cx="5943600" cy="4362450"/>
+                      <a:ext cx="5430008" cy="4420217"/>
                     </a:xfrm>
                     <a:prstGeom prst="rect">
                       <a:avLst/>
@@ -7239,6 +7282,4187 @@
     </w:p>
     <w:p>
       <w:pPr>
+        <w:spacing w:line="360" w:lineRule="auto"/>
+        <w:jc w:val="both"/>
+        <w:rPr>
+          <w:rFonts w:ascii="Times New Roman" w:hAnsi="Times New Roman" w:eastAsia="Times New Roman" w:cs="Times New Roman"/>
+          <w:b w:val="1"/>
+          <w:bCs w:val="1"/>
+          <w:i w:val="0"/>
+          <w:iCs w:val="0"/>
+          <w:caps w:val="0"/>
+          <w:smallCaps w:val="0"/>
+          <w:noProof w:val="0"/>
+          <w:color w:val="000000" w:themeColor="text1" w:themeTint="FF" w:themeShade="FF"/>
+          <w:sz w:val="28"/>
+          <w:szCs w:val="28"/>
+          <w:lang w:val="uk-UA"/>
+        </w:rPr>
+      </w:pPr>
+    </w:p>
+    <w:p>
+      <w:r>
+        <w:br w:type="page"/>
+      </w:r>
+    </w:p>
+    <w:p>
+      <w:pPr>
+        <w:spacing w:line="360" w:lineRule="auto"/>
+        <w:jc w:val="right"/>
+        <w:rPr>
+          <w:b w:val="1"/>
+          <w:bCs w:val="1"/>
+          <w:lang w:val="uk-UA"/>
+        </w:rPr>
+      </w:pPr>
+      <w:r>
+        <w:rPr>
+          <w:b w:val="1"/>
+          <w:bCs w:val="1"/>
+          <w:lang w:val="uk-UA"/>
+        </w:rPr>
+        <w:t>Звіт до Теми №</w:t>
+      </w:r>
+      <w:r>
+        <w:rPr>
+          <w:b w:val="1"/>
+          <w:bCs w:val="1"/>
+          <w:lang w:val="uk-UA"/>
+        </w:rPr>
+        <w:t>4</w:t>
+      </w:r>
+    </w:p>
+    <w:p>
+      <w:pPr>
+        <w:pStyle w:val="Normal"/>
+        <w:suppressLineNumbers w:val="0"/>
+        <w:bidi w:val="0"/>
+        <w:spacing w:before="240" w:beforeAutospacing="off" w:after="240" w:afterAutospacing="off" w:line="360" w:lineRule="auto"/>
+        <w:ind w:left="0" w:right="0" w:firstLine="720"/>
+        <w:jc w:val="right"/>
+      </w:pPr>
+      <w:r>
+        <w:rPr>
+          <w:b w:val="1"/>
+          <w:bCs w:val="1"/>
+          <w:lang w:val="uk-UA"/>
+        </w:rPr>
+        <w:t>Виняткові ситуації</w:t>
+      </w:r>
+    </w:p>
+    <w:p>
+      <w:pPr>
+        <w:spacing w:line="360" w:lineRule="auto"/>
+      </w:pPr>
+      <w:r>
+        <w:rPr>
+          <w:lang w:val="uk-UA"/>
+        </w:rPr>
+        <w:t>Під час виконання практичного завдання до Теми №4 було надано варіанти рішення до наступних задач:</w:t>
+      </w:r>
+    </w:p>
+    <w:p>
+      <w:pPr>
+        <w:pStyle w:val="Normal"/>
+        <w:spacing w:line="360" w:lineRule="auto"/>
+      </w:pPr>
+      <w:r>
+        <w:rPr>
+          <w:rFonts w:ascii="Times New Roman" w:hAnsi="Times New Roman" w:eastAsia="Times New Roman" w:cs="Times New Roman"/>
+          <w:b w:val="1"/>
+          <w:bCs w:val="1"/>
+          <w:i w:val="0"/>
+          <w:iCs w:val="0"/>
+          <w:caps w:val="0"/>
+          <w:smallCaps w:val="0"/>
+          <w:noProof w:val="0"/>
+          <w:color w:val="000000" w:themeColor="text1" w:themeTint="FF" w:themeShade="FF"/>
+          <w:sz w:val="28"/>
+          <w:szCs w:val="28"/>
+          <w:lang w:val="uk-UA"/>
+        </w:rPr>
+        <w:t>Розширити програму калькулятор функцією запитів даних для виконання операцій від користувача, що обробляє виняткові ситуації.</w:t>
+      </w:r>
+    </w:p>
+    <w:p>
+      <w:pPr>
+        <w:pStyle w:val="Normal"/>
+      </w:pPr>
+      <w:r>
+        <w:rPr>
+          <w:noProof w:val="0"/>
+          <w:lang w:val="uk-UA"/>
+        </w:rPr>
+        <w:t>Хід виконання завдання</w:t>
+      </w:r>
+    </w:p>
+    <w:p>
+      <w:pPr>
+        <w:pStyle w:val="Normal"/>
+      </w:pPr>
+      <w:r>
+        <w:rPr>
+          <w:noProof w:val="0"/>
+          <w:lang w:val="uk-UA"/>
+        </w:rPr>
+        <w:t xml:space="preserve">Під час виконання завдання було модифіковано раніше створену програму калькулятора, яка містила чотири функції </w:t>
+      </w:r>
+      <w:r>
+        <w:rPr>
+          <w:noProof w:val="0"/>
+          <w:lang w:val="uk-UA"/>
+        </w:rPr>
+        <w:t>sum()</w:t>
+      </w:r>
+      <w:r>
+        <w:rPr>
+          <w:noProof w:val="0"/>
+          <w:lang w:val="uk-UA"/>
+        </w:rPr>
+        <w:t xml:space="preserve">, </w:t>
+      </w:r>
+      <w:r>
+        <w:rPr>
+          <w:noProof w:val="0"/>
+          <w:lang w:val="uk-UA"/>
+        </w:rPr>
+        <w:t>rem()</w:t>
+      </w:r>
+      <w:r>
+        <w:rPr>
+          <w:noProof w:val="0"/>
+          <w:lang w:val="uk-UA"/>
+        </w:rPr>
+        <w:t xml:space="preserve">, </w:t>
+      </w:r>
+      <w:r>
+        <w:rPr>
+          <w:noProof w:val="0"/>
+          <w:lang w:val="uk-UA"/>
+        </w:rPr>
+        <w:t>mul()</w:t>
+      </w:r>
+      <w:r>
+        <w:rPr>
+          <w:noProof w:val="0"/>
+          <w:lang w:val="uk-UA"/>
+        </w:rPr>
+        <w:t xml:space="preserve"> та </w:t>
+      </w:r>
+      <w:r>
+        <w:rPr>
+          <w:noProof w:val="0"/>
+          <w:lang w:val="uk-UA"/>
+        </w:rPr>
+        <w:t>div()</w:t>
+      </w:r>
+      <w:r>
+        <w:rPr>
+          <w:noProof w:val="0"/>
+          <w:lang w:val="uk-UA"/>
+        </w:rPr>
+        <w:t xml:space="preserve"> для виконання основних математичних операцій: додавання, віднімання, множення та ділення.</w:t>
+      </w:r>
+    </w:p>
+    <w:p>
+      <w:pPr>
+        <w:pStyle w:val="Normal"/>
+      </w:pPr>
+      <w:r>
+        <w:rPr>
+          <w:noProof w:val="0"/>
+          <w:lang w:val="uk-UA"/>
+        </w:rPr>
+        <w:t xml:space="preserve">До програми було додано можливість перевірки правильності введених користувачем даних та обробки виняткових ситуацій. Для забезпечення багаторазового виконання операцій було збережено цикл </w:t>
+      </w:r>
+      <w:r>
+        <w:rPr>
+          <w:noProof w:val="0"/>
+          <w:lang w:val="uk-UA"/>
+        </w:rPr>
+        <w:t>while True</w:t>
+      </w:r>
+      <w:r>
+        <w:rPr>
+          <w:noProof w:val="0"/>
+          <w:lang w:val="uk-UA"/>
+        </w:rPr>
+        <w:t>, який дозволяє користувачу виконувати обчислення до завершення роботи програми.</w:t>
+      </w:r>
+    </w:p>
+    <w:p>
+      <w:pPr>
+        <w:pStyle w:val="Normal"/>
+      </w:pPr>
+      <w:r>
+        <w:rPr>
+          <w:noProof w:val="0"/>
+          <w:lang w:val="uk-UA"/>
+        </w:rPr>
+        <w:t xml:space="preserve">Було додано перевірку введеного символу математичної операції за допомогою умовного оператора </w:t>
+      </w:r>
+      <w:r>
+        <w:rPr>
+          <w:noProof w:val="0"/>
+          <w:lang w:val="uk-UA"/>
+        </w:rPr>
+        <w:t>if</w:t>
+      </w:r>
+      <w:r>
+        <w:rPr>
+          <w:noProof w:val="0"/>
+          <w:lang w:val="uk-UA"/>
+        </w:rPr>
+        <w:t xml:space="preserve">. Якщо користувач вводить символ </w:t>
+      </w:r>
+      <w:r>
+        <w:rPr>
+          <w:noProof w:val="0"/>
+          <w:lang w:val="uk-UA"/>
+        </w:rPr>
+        <w:t>q</w:t>
+      </w:r>
+      <w:r>
+        <w:rPr>
+          <w:noProof w:val="0"/>
+          <w:lang w:val="uk-UA"/>
+        </w:rPr>
+        <w:t xml:space="preserve">, програма завершує роботу за допомогою </w:t>
+      </w:r>
+      <w:r>
+        <w:rPr>
+          <w:noProof w:val="0"/>
+          <w:lang w:val="uk-UA"/>
+        </w:rPr>
+        <w:t>break</w:t>
+      </w:r>
+      <w:r>
+        <w:rPr>
+          <w:noProof w:val="0"/>
+          <w:lang w:val="uk-UA"/>
+        </w:rPr>
+        <w:t xml:space="preserve">. У разі введення неправильного символу виводиться повідомлення про помилку, а команда </w:t>
+      </w:r>
+      <w:r>
+        <w:rPr>
+          <w:noProof w:val="0"/>
+          <w:lang w:val="uk-UA"/>
+        </w:rPr>
+        <w:t>continue</w:t>
+      </w:r>
+      <w:r>
+        <w:rPr>
+          <w:noProof w:val="0"/>
+          <w:lang w:val="uk-UA"/>
+        </w:rPr>
+        <w:t xml:space="preserve"> повертає програму на початок циклу.</w:t>
+      </w:r>
+    </w:p>
+    <w:p>
+      <w:pPr>
+        <w:pStyle w:val="Normal"/>
+      </w:pPr>
+      <w:r>
+        <w:rPr>
+          <w:noProof w:val="0"/>
+          <w:lang w:val="uk-UA"/>
+        </w:rPr>
+        <w:t xml:space="preserve">Для введення чисел використовується функція </w:t>
+      </w:r>
+      <w:r>
+        <w:rPr>
+          <w:noProof w:val="0"/>
+          <w:lang w:val="uk-UA"/>
+        </w:rPr>
+        <w:t>input()</w:t>
+      </w:r>
+      <w:r>
+        <w:rPr>
+          <w:noProof w:val="0"/>
+          <w:lang w:val="uk-UA"/>
+        </w:rPr>
+        <w:t xml:space="preserve">, а їх перетворення на цілочисельний тип здійснюється за допомогою </w:t>
+      </w:r>
+      <w:r>
+        <w:rPr>
+          <w:noProof w:val="0"/>
+          <w:lang w:val="uk-UA"/>
+        </w:rPr>
+        <w:t>int()</w:t>
+      </w:r>
+      <w:r>
+        <w:rPr>
+          <w:noProof w:val="0"/>
+          <w:lang w:val="uk-UA"/>
+        </w:rPr>
+        <w:t xml:space="preserve">. Вибір математичної операції, як і в попередній версії програми, виконується через конструкцію </w:t>
+      </w:r>
+      <w:r>
+        <w:rPr>
+          <w:noProof w:val="0"/>
+          <w:lang w:val="uk-UA"/>
+        </w:rPr>
+        <w:t>match case</w:t>
+      </w:r>
+      <w:r>
+        <w:rPr>
+          <w:noProof w:val="0"/>
+          <w:lang w:val="uk-UA"/>
+        </w:rPr>
+        <w:t>.</w:t>
+      </w:r>
+    </w:p>
+    <w:p>
+      <w:pPr>
+        <w:pStyle w:val="Normal"/>
+      </w:pPr>
+      <w:r>
+        <w:rPr>
+          <w:noProof w:val="0"/>
+          <w:lang w:val="uk-UA"/>
+        </w:rPr>
+        <w:t xml:space="preserve">Основним доповненням стала конструкція </w:t>
+      </w:r>
+      <w:r>
+        <w:rPr>
+          <w:noProof w:val="0"/>
+          <w:lang w:val="uk-UA"/>
+        </w:rPr>
+        <w:t>try except</w:t>
+      </w:r>
+      <w:r>
+        <w:rPr>
+          <w:noProof w:val="0"/>
+          <w:lang w:val="uk-UA"/>
+        </w:rPr>
+        <w:t xml:space="preserve">, яка забезпечує обробку виняткових ситуацій. За допомогою </w:t>
+      </w:r>
+      <w:r>
+        <w:rPr>
+          <w:noProof w:val="0"/>
+          <w:lang w:val="uk-UA"/>
+        </w:rPr>
+        <w:t>except ValueError</w:t>
+      </w:r>
+      <w:r>
+        <w:rPr>
+          <w:noProof w:val="0"/>
+          <w:lang w:val="uk-UA"/>
+        </w:rPr>
+        <w:t xml:space="preserve"> обробляються помилки введення нечислових значень, а </w:t>
+      </w:r>
+      <w:r>
+        <w:rPr>
+          <w:noProof w:val="0"/>
+          <w:lang w:val="uk-UA"/>
+        </w:rPr>
+        <w:t>except ZeroDivisionError</w:t>
+      </w:r>
+      <w:r>
+        <w:rPr>
+          <w:noProof w:val="0"/>
+          <w:lang w:val="uk-UA"/>
+        </w:rPr>
+        <w:t xml:space="preserve"> дозволяє уникнути аварійного завершення програми під час ділення на нуль.</w:t>
+      </w:r>
+    </w:p>
+    <w:p>
+      <w:pPr>
+        <w:pStyle w:val="Normal"/>
+      </w:pPr>
+      <w:r>
+        <w:rPr>
+          <w:noProof w:val="0"/>
+          <w:lang w:val="uk-UA"/>
+        </w:rPr>
+        <w:t>Таким чином, було вдосконалено раніше розроблений калькулятор шляхом додавання перевірки введених даних та механізму обробки помилок, що забезпечило більш надійну та стабільну роботу програми.</w:t>
+      </w:r>
+    </w:p>
+    <w:p>
+      <w:pPr>
+        <w:pStyle w:val="Normal"/>
+      </w:pPr>
+      <w:r>
+        <w:rPr>
+          <w:lang w:val="uk-UA"/>
+        </w:rPr>
+        <w:t>Текст програми:</w:t>
+      </w:r>
+    </w:p>
+    <w:p>
+      <w:pPr>
+        <w:pStyle w:val="Normal"/>
+      </w:pPr>
+      <w:r>
+        <w:drawing>
+          <wp:inline wp14:editId="6B804ECB" wp14:anchorId="6F6CBA4A">
+            <wp:extent cx="3924300" cy="5943600"/>
+            <wp:effectExtent l="0" t="0" r="0" b="0"/>
+            <wp:docPr id="1926064567" name="drawing"/>
+            <wp:cNvGraphicFramePr>
+              <a:graphicFrameLocks noChangeAspect="1"/>
+            </wp:cNvGraphicFramePr>
+            <a:graphic>
+              <a:graphicData xmlns:a="http://schemas.openxmlformats.org/drawingml/2006/main" uri="http://schemas.openxmlformats.org/drawingml/2006/picture">
+                <pic:pic xmlns:pic="http://schemas.openxmlformats.org/drawingml/2006/picture">
+                  <pic:nvPicPr>
+                    <pic:cNvPr id="1926064567" name="Picture 1926064567"/>
+                    <pic:cNvPicPr/>
+                  </pic:nvPicPr>
+                  <pic:blipFill>
+                    <a:blip xmlns:r="http://schemas.openxmlformats.org/officeDocument/2006/relationships" r:embed="rId196636964">
+                      <a:extLst>
+                        <a:ext uri="{28A0092B-C50C-407E-A947-70E740481C1C}">
+                          <a14:useLocalDpi xmlns:a14="http://schemas.microsoft.com/office/drawing/2010/main"/>
+                        </a:ext>
+                      </a:extLst>
+                    </a:blip>
+                    <a:stretch>
+                      <a:fillRect/>
+                    </a:stretch>
+                  </pic:blipFill>
+                  <pic:spPr>
+                    <a:xfrm>
+                      <a:off x="0" y="0"/>
+                      <a:ext cx="3924300" cy="5943600"/>
+                    </a:xfrm>
+                    <a:prstGeom prst="rect">
+                      <a:avLst/>
+                    </a:prstGeom>
+                  </pic:spPr>
+                </pic:pic>
+              </a:graphicData>
+            </a:graphic>
+          </wp:inline>
+        </w:drawing>
+      </w:r>
+    </w:p>
+    <w:p>
+      <w:pPr>
+        <w:pStyle w:val="Normal"/>
+        <w:spacing w:before="240" w:beforeAutospacing="off" w:after="240" w:afterAutospacing="off" w:line="360" w:lineRule="auto"/>
+      </w:pPr>
+      <w:r>
+        <w:rPr>
+          <w:lang w:val="uk-UA"/>
+        </w:rPr>
+        <w:t xml:space="preserve">Посилання на </w:t>
+      </w:r>
+      <w:r>
+        <w:rPr/>
+        <w:t>github</w:t>
+      </w:r>
+      <w:r>
+        <w:rPr>
+          <w:lang w:val="ru-RU"/>
+        </w:rPr>
+        <w:t>:</w:t>
+      </w:r>
+      <w:r>
+        <w:rPr>
+          <w:lang w:val="ru-RU"/>
+        </w:rPr>
+        <w:t xml:space="preserve"> https://github.com/igor231083-cmd/TP-KB-251-Igor-Kharcenko/blob/main/Topic_04/test01.py</w:t>
+      </w:r>
+    </w:p>
+    <w:p>
+      <w:pPr>
+        <w:pStyle w:val="Normal"/>
+      </w:pPr>
+      <w:r>
+        <w:rPr>
+          <w:lang w:val="uk-UA"/>
+        </w:rPr>
+        <w:t xml:space="preserve">Знімок екрану з посилання на </w:t>
+      </w:r>
+      <w:r>
+        <w:rPr/>
+        <w:t>github</w:t>
+      </w:r>
+      <w:r>
+        <w:rPr/>
+        <w:t>:</w:t>
+      </w:r>
+    </w:p>
+    <w:p>
+      <w:pPr>
+        <w:pStyle w:val="Normal"/>
+        <w:ind w:left="720"/>
+      </w:pPr>
+      <w:r>
+        <w:drawing>
+          <wp:inline wp14:editId="75D6082A" wp14:anchorId="45D3282D">
+            <wp:extent cx="3181350" cy="5943600"/>
+            <wp:effectExtent l="0" t="0" r="0" b="0"/>
+            <wp:docPr id="159399274" name="drawing"/>
+            <wp:cNvGraphicFramePr>
+              <a:graphicFrameLocks noChangeAspect="1"/>
+            </wp:cNvGraphicFramePr>
+            <a:graphic>
+              <a:graphicData xmlns:a="http://schemas.openxmlformats.org/drawingml/2006/main" uri="http://schemas.openxmlformats.org/drawingml/2006/picture">
+                <pic:pic xmlns:pic="http://schemas.openxmlformats.org/drawingml/2006/picture">
+                  <pic:nvPicPr>
+                    <pic:cNvPr id="159399274" name="Picture 159399274"/>
+                    <pic:cNvPicPr/>
+                  </pic:nvPicPr>
+                  <pic:blipFill>
+                    <a:blip xmlns:r="http://schemas.openxmlformats.org/officeDocument/2006/relationships" r:embed="rId925335464">
+                      <a:extLst>
+                        <a:ext uri="{28A0092B-C50C-407E-A947-70E740481C1C}">
+                          <a14:useLocalDpi xmlns:a14="http://schemas.microsoft.com/office/drawing/2010/main"/>
+                        </a:ext>
+                      </a:extLst>
+                    </a:blip>
+                    <a:stretch>
+                      <a:fillRect/>
+                    </a:stretch>
+                  </pic:blipFill>
+                  <pic:spPr>
+                    <a:xfrm>
+                      <a:off x="0" y="0"/>
+                      <a:ext cx="3181350" cy="5943600"/>
+                    </a:xfrm>
+                    <a:prstGeom prst="rect">
+                      <a:avLst/>
+                    </a:prstGeom>
+                  </pic:spPr>
+                </pic:pic>
+              </a:graphicData>
+            </a:graphic>
+          </wp:inline>
+        </w:drawing>
+      </w:r>
+    </w:p>
+    <w:p>
+      <w:pPr>
+        <w:pStyle w:val="Normal"/>
+      </w:pPr>
+      <w:r>
+        <w:rPr>
+          <w:rFonts w:ascii="Times New Roman" w:hAnsi="Times New Roman" w:eastAsia="Times New Roman" w:cs="Times New Roman"/>
+          <w:b w:val="1"/>
+          <w:bCs w:val="1"/>
+          <w:i w:val="0"/>
+          <w:iCs w:val="0"/>
+          <w:caps w:val="0"/>
+          <w:smallCaps w:val="0"/>
+          <w:strike w:val="0"/>
+          <w:dstrike w:val="0"/>
+          <w:noProof w:val="0"/>
+          <w:color w:val="000000" w:themeColor="text1" w:themeTint="FF" w:themeShade="FF"/>
+          <w:sz w:val="28"/>
+          <w:szCs w:val="28"/>
+          <w:u w:val="none"/>
+          <w:lang w:val="uk-UA"/>
+        </w:rPr>
+        <w:t>Розширити функцію ділення обробкою виняткової ситуації ділення но нуль</w:t>
+      </w:r>
+    </w:p>
+    <w:p>
+      <w:pPr>
+        <w:pStyle w:val="Normal"/>
+      </w:pPr>
+      <w:r>
+        <w:rPr>
+          <w:noProof w:val="0"/>
+          <w:lang w:val="uk-UA"/>
+        </w:rPr>
+        <w:t>Хід виконання завдання</w:t>
+      </w:r>
+    </w:p>
+    <w:p>
+      <w:pPr>
+        <w:pStyle w:val="Normal"/>
+      </w:pPr>
+      <w:r>
+        <w:rPr>
+          <w:noProof w:val="0"/>
+          <w:lang w:val="uk-UA"/>
+        </w:rPr>
+        <w:t xml:space="preserve">Під час виконання завдання було модифіковано раніше створену програму калькулятора, а саме функцію </w:t>
+      </w:r>
+      <w:r>
+        <w:rPr>
+          <w:noProof w:val="0"/>
+          <w:lang w:val="uk-UA"/>
+        </w:rPr>
+        <w:t>div()</w:t>
+      </w:r>
+      <w:r>
+        <w:rPr>
+          <w:noProof w:val="0"/>
+          <w:lang w:val="uk-UA"/>
+        </w:rPr>
+        <w:t>, яка відповідає за виконання операції ділення двох чисел.</w:t>
+      </w:r>
+    </w:p>
+    <w:p>
+      <w:pPr>
+        <w:pStyle w:val="Normal"/>
+      </w:pPr>
+      <w:r>
+        <w:rPr>
+          <w:noProof w:val="0"/>
+          <w:lang w:val="uk-UA"/>
+        </w:rPr>
+        <w:t xml:space="preserve">До функції </w:t>
+      </w:r>
+      <w:r>
+        <w:rPr>
+          <w:noProof w:val="0"/>
+          <w:lang w:val="uk-UA"/>
+        </w:rPr>
+        <w:t>div()</w:t>
+      </w:r>
+      <w:r>
+        <w:rPr>
+          <w:noProof w:val="0"/>
+          <w:lang w:val="uk-UA"/>
+        </w:rPr>
+        <w:t xml:space="preserve"> було додано конструкцію </w:t>
+      </w:r>
+      <w:r>
+        <w:rPr>
+          <w:noProof w:val="0"/>
+          <w:lang w:val="uk-UA"/>
+        </w:rPr>
+        <w:t>try except</w:t>
+      </w:r>
+      <w:r>
+        <w:rPr>
+          <w:noProof w:val="0"/>
+          <w:lang w:val="uk-UA"/>
+        </w:rPr>
+        <w:t xml:space="preserve"> для обробки виняткової ситуації ділення на нуль. Усередині блоку </w:t>
+      </w:r>
+      <w:r>
+        <w:rPr>
+          <w:noProof w:val="0"/>
+          <w:lang w:val="uk-UA"/>
+        </w:rPr>
+        <w:t>try</w:t>
+      </w:r>
+      <w:r>
+        <w:rPr>
+          <w:noProof w:val="0"/>
+          <w:lang w:val="uk-UA"/>
+        </w:rPr>
+        <w:t xml:space="preserve"> виконується математична операція ділення, після чого отриманий результат повертається за допомогою </w:t>
+      </w:r>
+      <w:r>
+        <w:rPr>
+          <w:noProof w:val="0"/>
+          <w:lang w:val="uk-UA"/>
+        </w:rPr>
+        <w:t>return</w:t>
+      </w:r>
+      <w:r>
+        <w:rPr>
+          <w:noProof w:val="0"/>
+          <w:lang w:val="uk-UA"/>
+        </w:rPr>
+        <w:t>.</w:t>
+      </w:r>
+    </w:p>
+    <w:p>
+      <w:pPr>
+        <w:pStyle w:val="Normal"/>
+      </w:pPr>
+      <w:r>
+        <w:rPr>
+          <w:noProof w:val="0"/>
+          <w:lang w:val="uk-UA"/>
+        </w:rPr>
+        <w:t xml:space="preserve">Якщо користувач намагається поділити число на нуль, виникає виняток </w:t>
+      </w:r>
+      <w:r>
+        <w:rPr>
+          <w:noProof w:val="0"/>
+          <w:lang w:val="uk-UA"/>
+        </w:rPr>
+        <w:t>ZeroDivisionError</w:t>
+      </w:r>
+      <w:r>
+        <w:rPr>
+          <w:noProof w:val="0"/>
+          <w:lang w:val="uk-UA"/>
+        </w:rPr>
+        <w:t xml:space="preserve">, який обробляється відповідним блоком </w:t>
+      </w:r>
+      <w:r>
+        <w:rPr>
+          <w:noProof w:val="0"/>
+          <w:lang w:val="uk-UA"/>
+        </w:rPr>
+        <w:t>except</w:t>
+      </w:r>
+      <w:r>
+        <w:rPr>
+          <w:noProof w:val="0"/>
+          <w:lang w:val="uk-UA"/>
+        </w:rPr>
+        <w:t xml:space="preserve">. У такому випадку програма виводить повідомлення </w:t>
+      </w:r>
+      <w:r>
+        <w:rPr>
+          <w:noProof w:val="0"/>
+          <w:lang w:val="uk-UA"/>
+        </w:rPr>
+        <w:t>Error: Cannot divide by zero</w:t>
+      </w:r>
+      <w:r>
+        <w:rPr>
+          <w:noProof w:val="0"/>
+          <w:lang w:val="uk-UA"/>
+        </w:rPr>
+        <w:t xml:space="preserve">, а функція повертає значення </w:t>
+      </w:r>
+      <w:r>
+        <w:rPr>
+          <w:noProof w:val="0"/>
+          <w:lang w:val="uk-UA"/>
+        </w:rPr>
+        <w:t>None</w:t>
+      </w:r>
+      <w:r>
+        <w:rPr>
+          <w:noProof w:val="0"/>
+          <w:lang w:val="uk-UA"/>
+        </w:rPr>
+        <w:t xml:space="preserve"> замість числового результату.</w:t>
+      </w:r>
+    </w:p>
+    <w:p>
+      <w:pPr>
+        <w:pStyle w:val="Normal"/>
+      </w:pPr>
+      <w:r>
+        <w:rPr>
+          <w:noProof w:val="0"/>
+          <w:lang w:val="uk-UA"/>
+        </w:rPr>
+        <w:t xml:space="preserve">Також було модифіковано обробку операції ділення в конструкції </w:t>
+      </w:r>
+      <w:r>
+        <w:rPr>
+          <w:noProof w:val="0"/>
+          <w:lang w:val="uk-UA"/>
+        </w:rPr>
+        <w:t>match case</w:t>
+      </w:r>
+      <w:r>
+        <w:rPr>
+          <w:noProof w:val="0"/>
+          <w:lang w:val="uk-UA"/>
+        </w:rPr>
+        <w:t xml:space="preserve">. Тепер результат виконання функції </w:t>
+      </w:r>
+      <w:r>
+        <w:rPr>
+          <w:noProof w:val="0"/>
+          <w:lang w:val="uk-UA"/>
+        </w:rPr>
+        <w:t>div()</w:t>
+      </w:r>
+      <w:r>
+        <w:rPr>
+          <w:noProof w:val="0"/>
+          <w:lang w:val="uk-UA"/>
+        </w:rPr>
+        <w:t xml:space="preserve"> зберігається у змінній </w:t>
+      </w:r>
+      <w:r>
+        <w:rPr>
+          <w:noProof w:val="0"/>
+          <w:lang w:val="uk-UA"/>
+        </w:rPr>
+        <w:t>result</w:t>
+      </w:r>
+      <w:r>
+        <w:rPr>
+          <w:noProof w:val="0"/>
+          <w:lang w:val="uk-UA"/>
+        </w:rPr>
+        <w:t xml:space="preserve">. За допомогою умовного оператора </w:t>
+      </w:r>
+      <w:r>
+        <w:rPr>
+          <w:noProof w:val="0"/>
+          <w:lang w:val="uk-UA"/>
+        </w:rPr>
+        <w:t>if result != None</w:t>
+      </w:r>
+      <w:r>
+        <w:rPr>
+          <w:noProof w:val="0"/>
+          <w:lang w:val="uk-UA"/>
+        </w:rPr>
+        <w:t xml:space="preserve"> здійснюється перевірка отриманого значення. Якщо результат не дорівнює </w:t>
+      </w:r>
+      <w:r>
+        <w:rPr>
+          <w:noProof w:val="0"/>
+          <w:lang w:val="uk-UA"/>
+        </w:rPr>
+        <w:t>None</w:t>
+      </w:r>
+      <w:r>
+        <w:rPr>
+          <w:noProof w:val="0"/>
+          <w:lang w:val="uk-UA"/>
+        </w:rPr>
+        <w:t>, він виводиться на екран.</w:t>
+      </w:r>
+    </w:p>
+    <w:p>
+      <w:pPr>
+        <w:pStyle w:val="Normal"/>
+      </w:pPr>
+      <w:r>
+        <w:rPr>
+          <w:noProof w:val="0"/>
+          <w:lang w:val="uk-UA"/>
+        </w:rPr>
+        <w:t>Інші математичні функції та механізм введення даних залишилися без змін. Завдяки внесеним доповненням програма продовжує працювати навіть після спроби ділення на нуль, дозволяючи користувачу виконувати наступні обчислення.</w:t>
+      </w:r>
+    </w:p>
+    <w:p>
+      <w:pPr>
+        <w:pStyle w:val="Normal"/>
+      </w:pPr>
+      <w:r>
+        <w:rPr>
+          <w:noProof w:val="0"/>
+          <w:lang w:val="uk-UA"/>
+        </w:rPr>
+        <w:t xml:space="preserve">Таким чином, було вдосконалено функцію ділення шляхом додавання обробки виняткової ситуації </w:t>
+      </w:r>
+      <w:r>
+        <w:rPr>
+          <w:noProof w:val="0"/>
+          <w:lang w:val="uk-UA"/>
+        </w:rPr>
+        <w:t>ZeroDivisionError</w:t>
+      </w:r>
+      <w:r>
+        <w:rPr>
+          <w:noProof w:val="0"/>
+          <w:lang w:val="uk-UA"/>
+        </w:rPr>
+        <w:t>, що дозволило запобігти аварійному завершенню програми та підвищити її надійність.</w:t>
+      </w:r>
+    </w:p>
+    <w:p>
+      <w:pPr>
+        <w:pStyle w:val="Normal"/>
+      </w:pPr>
+      <w:r>
+        <w:rPr>
+          <w:lang w:val="uk-UA"/>
+        </w:rPr>
+        <w:t>Текст програми:</w:t>
+      </w:r>
+    </w:p>
+    <w:p>
+      <w:pPr>
+        <w:pStyle w:val="Normal"/>
+        <w:ind w:left="720"/>
+      </w:pPr>
+      <w:r>
+        <w:drawing>
+          <wp:inline wp14:editId="70E0C21F" wp14:anchorId="6DA5CD52">
+            <wp:extent cx="3657600" cy="5943600"/>
+            <wp:effectExtent l="0" t="0" r="0" b="0"/>
+            <wp:docPr id="1149489881" name="drawing"/>
+            <wp:cNvGraphicFramePr>
+              <a:graphicFrameLocks noChangeAspect="1"/>
+            </wp:cNvGraphicFramePr>
+            <a:graphic>
+              <a:graphicData xmlns:a="http://schemas.openxmlformats.org/drawingml/2006/main" uri="http://schemas.openxmlformats.org/drawingml/2006/picture">
+                <pic:pic xmlns:pic="http://schemas.openxmlformats.org/drawingml/2006/picture">
+                  <pic:nvPicPr>
+                    <pic:cNvPr id="1149489881" name="Picture 1149489881"/>
+                    <pic:cNvPicPr/>
+                  </pic:nvPicPr>
+                  <pic:blipFill>
+                    <a:blip xmlns:r="http://schemas.openxmlformats.org/officeDocument/2006/relationships" r:embed="rId600569197">
+                      <a:extLst>
+                        <a:ext uri="{28A0092B-C50C-407E-A947-70E740481C1C}">
+                          <a14:useLocalDpi xmlns:a14="http://schemas.microsoft.com/office/drawing/2010/main"/>
+                        </a:ext>
+                      </a:extLst>
+                    </a:blip>
+                    <a:stretch>
+                      <a:fillRect/>
+                    </a:stretch>
+                  </pic:blipFill>
+                  <pic:spPr>
+                    <a:xfrm>
+                      <a:off x="0" y="0"/>
+                      <a:ext cx="3657600" cy="5943600"/>
+                    </a:xfrm>
+                    <a:prstGeom prst="rect">
+                      <a:avLst/>
+                    </a:prstGeom>
+                  </pic:spPr>
+                </pic:pic>
+              </a:graphicData>
+            </a:graphic>
+          </wp:inline>
+        </w:drawing>
+      </w:r>
+    </w:p>
+    <w:p>
+      <w:pPr>
+        <w:pStyle w:val="Normal"/>
+        <w:spacing w:before="240" w:beforeAutospacing="off" w:after="240" w:afterAutospacing="off" w:line="360" w:lineRule="auto"/>
+      </w:pPr>
+      <w:r>
+        <w:rPr>
+          <w:lang w:val="uk-UA"/>
+        </w:rPr>
+        <w:t xml:space="preserve">Посилання на </w:t>
+      </w:r>
+      <w:r>
+        <w:rPr/>
+        <w:t>github</w:t>
+      </w:r>
+      <w:r>
+        <w:rPr>
+          <w:lang w:val="ru-RU"/>
+        </w:rPr>
+        <w:t>:</w:t>
+      </w:r>
+      <w:r>
+        <w:rPr>
+          <w:lang w:val="ru-RU"/>
+        </w:rPr>
+        <w:t xml:space="preserve"> </w:t>
+      </w:r>
+      <w:r>
+        <w:rPr>
+          <w:lang w:val="ru-RU"/>
+        </w:rPr>
+        <w:t>https://github.com/igor231083-cmd/TP-KB-251-Igor-Kharcenko/blob/main/Topic_04/test02.py</w:t>
+      </w:r>
+    </w:p>
+    <w:p>
+      <w:pPr>
+        <w:pStyle w:val="Normal"/>
+      </w:pPr>
+      <w:r>
+        <w:rPr>
+          <w:lang w:val="uk-UA"/>
+        </w:rPr>
+        <w:t xml:space="preserve">Знімок екрану з посилання на </w:t>
+      </w:r>
+      <w:r>
+        <w:rPr/>
+        <w:t>github</w:t>
+      </w:r>
+      <w:r>
+        <w:rPr/>
+        <w:t>:</w:t>
+      </w:r>
+    </w:p>
+    <w:p>
+      <w:pPr>
+        <w:pStyle w:val="Normal"/>
+        <w:ind w:left="720"/>
+      </w:pPr>
+      <w:r>
+        <w:drawing>
+          <wp:inline wp14:editId="14CBB439" wp14:anchorId="692CA444">
+            <wp:extent cx="2533650" cy="5943600"/>
+            <wp:effectExtent l="0" t="0" r="0" b="0"/>
+            <wp:docPr id="1708173059" name="drawing"/>
+            <wp:cNvGraphicFramePr>
+              <a:graphicFrameLocks noChangeAspect="1"/>
+            </wp:cNvGraphicFramePr>
+            <a:graphic>
+              <a:graphicData xmlns:a="http://schemas.openxmlformats.org/drawingml/2006/main" uri="http://schemas.openxmlformats.org/drawingml/2006/picture">
+                <pic:pic xmlns:pic="http://schemas.openxmlformats.org/drawingml/2006/picture">
+                  <pic:nvPicPr>
+                    <pic:cNvPr id="1708173059" name="Picture 1708173059"/>
+                    <pic:cNvPicPr/>
+                  </pic:nvPicPr>
+                  <pic:blipFill>
+                    <a:blip xmlns:r="http://schemas.openxmlformats.org/officeDocument/2006/relationships" r:embed="rId1819296815">
+                      <a:extLst>
+                        <a:ext uri="{28A0092B-C50C-407E-A947-70E740481C1C}">
+                          <a14:useLocalDpi xmlns:a14="http://schemas.microsoft.com/office/drawing/2010/main"/>
+                        </a:ext>
+                      </a:extLst>
+                    </a:blip>
+                    <a:stretch>
+                      <a:fillRect/>
+                    </a:stretch>
+                  </pic:blipFill>
+                  <pic:spPr>
+                    <a:xfrm>
+                      <a:off x="0" y="0"/>
+                      <a:ext cx="2533650" cy="5943600"/>
+                    </a:xfrm>
+                    <a:prstGeom prst="rect">
+                      <a:avLst/>
+                    </a:prstGeom>
+                  </pic:spPr>
+                </pic:pic>
+              </a:graphicData>
+            </a:graphic>
+          </wp:inline>
+        </w:drawing>
+      </w:r>
+    </w:p>
+    <w:p>
+      <w:pPr>
+        <w:spacing w:line="360" w:lineRule="auto"/>
+        <w:jc w:val="right"/>
+        <w:rPr>
+          <w:b w:val="1"/>
+          <w:bCs w:val="1"/>
+          <w:lang w:val="uk-UA"/>
+        </w:rPr>
+      </w:pPr>
+    </w:p>
+    <w:p>
+      <w:r>
+        <w:br w:type="page"/>
+      </w:r>
+    </w:p>
+    <w:p>
+      <w:pPr>
+        <w:pStyle w:val="Normal"/>
+        <w:spacing w:line="360" w:lineRule="auto"/>
+        <w:jc w:val="right"/>
+        <w:rPr>
+          <w:b w:val="1"/>
+          <w:bCs w:val="1"/>
+          <w:lang w:val="uk-UA"/>
+        </w:rPr>
+      </w:pPr>
+      <w:r>
+        <w:rPr>
+          <w:b w:val="1"/>
+          <w:bCs w:val="1"/>
+          <w:lang w:val="uk-UA"/>
+        </w:rPr>
+        <w:t>Звіт до Теми №5</w:t>
+      </w:r>
+    </w:p>
+    <w:p>
+      <w:pPr>
+        <w:pStyle w:val="Normal"/>
+        <w:suppressLineNumbers w:val="0"/>
+        <w:bidi w:val="0"/>
+        <w:spacing w:before="240" w:beforeAutospacing="off" w:after="240" w:afterAutospacing="off" w:line="360" w:lineRule="auto"/>
+        <w:ind w:left="0" w:right="0" w:firstLine="720"/>
+        <w:jc w:val="right"/>
+      </w:pPr>
+      <w:r>
+        <w:rPr>
+          <w:b w:val="1"/>
+          <w:bCs w:val="1"/>
+          <w:lang w:val="uk-UA"/>
+        </w:rPr>
+        <w:t>Бібліотеки</w:t>
+      </w:r>
+    </w:p>
+    <w:p>
+      <w:pPr>
+        <w:spacing w:line="360" w:lineRule="auto"/>
+      </w:pPr>
+      <w:r>
+        <w:rPr>
+          <w:lang w:val="uk-UA"/>
+        </w:rPr>
+        <w:t>Під час виконання практичного завдання до Теми №5 було надано варіанти рішення до наступних задач:</w:t>
+      </w:r>
+    </w:p>
+    <w:p>
+      <w:pPr>
+        <w:spacing w:line="360" w:lineRule="auto"/>
+        <w:jc w:val="both"/>
+        <w:rPr>
+          <w:rFonts w:ascii="Times New Roman" w:hAnsi="Times New Roman" w:eastAsia="Times New Roman" w:cs="Times New Roman"/>
+          <w:b w:val="1"/>
+          <w:bCs w:val="1"/>
+          <w:noProof w:val="0"/>
+          <w:sz w:val="28"/>
+          <w:szCs w:val="28"/>
+          <w:lang w:val="uk-UA"/>
+        </w:rPr>
+      </w:pPr>
+      <w:r>
+        <w:rPr>
+          <w:rFonts w:ascii="Times New Roman" w:hAnsi="Times New Roman" w:eastAsia="Times New Roman" w:cs="Times New Roman"/>
+          <w:b w:val="1"/>
+          <w:bCs w:val="1"/>
+          <w:i w:val="0"/>
+          <w:iCs w:val="0"/>
+          <w:caps w:val="0"/>
+          <w:smallCaps w:val="0"/>
+          <w:noProof w:val="0"/>
+          <w:color w:val="000000" w:themeColor="text1" w:themeTint="FF" w:themeShade="FF"/>
+          <w:sz w:val="28"/>
+          <w:szCs w:val="28"/>
+          <w:lang w:val="uk-UA"/>
+        </w:rPr>
+        <w:t>Гра з комп’ютером: камінь, ножиці, папір. Програма виконує запит від користувача на введення одного із значень ["</w:t>
+      </w:r>
+      <w:r>
+        <w:rPr>
+          <w:rFonts w:ascii="Times New Roman" w:hAnsi="Times New Roman" w:eastAsia="Times New Roman" w:cs="Times New Roman"/>
+          <w:b w:val="1"/>
+          <w:bCs w:val="1"/>
+          <w:i w:val="0"/>
+          <w:iCs w:val="0"/>
+          <w:caps w:val="0"/>
+          <w:smallCaps w:val="0"/>
+          <w:noProof w:val="0"/>
+          <w:color w:val="000000" w:themeColor="text1" w:themeTint="FF" w:themeShade="FF"/>
+          <w:sz w:val="28"/>
+          <w:szCs w:val="28"/>
+          <w:lang w:val="uk-UA"/>
+        </w:rPr>
+        <w:t>stone</w:t>
+      </w:r>
+      <w:r>
+        <w:rPr>
+          <w:rFonts w:ascii="Times New Roman" w:hAnsi="Times New Roman" w:eastAsia="Times New Roman" w:cs="Times New Roman"/>
+          <w:b w:val="1"/>
+          <w:bCs w:val="1"/>
+          <w:i w:val="0"/>
+          <w:iCs w:val="0"/>
+          <w:caps w:val="0"/>
+          <w:smallCaps w:val="0"/>
+          <w:noProof w:val="0"/>
+          <w:color w:val="000000" w:themeColor="text1" w:themeTint="FF" w:themeShade="FF"/>
+          <w:sz w:val="28"/>
+          <w:szCs w:val="28"/>
+          <w:lang w:val="uk-UA"/>
+        </w:rPr>
+        <w:t>", "</w:t>
+      </w:r>
+      <w:r>
+        <w:rPr>
+          <w:rFonts w:ascii="Times New Roman" w:hAnsi="Times New Roman" w:eastAsia="Times New Roman" w:cs="Times New Roman"/>
+          <w:b w:val="1"/>
+          <w:bCs w:val="1"/>
+          <w:i w:val="0"/>
+          <w:iCs w:val="0"/>
+          <w:caps w:val="0"/>
+          <w:smallCaps w:val="0"/>
+          <w:noProof w:val="0"/>
+          <w:color w:val="000000" w:themeColor="text1" w:themeTint="FF" w:themeShade="FF"/>
+          <w:sz w:val="28"/>
+          <w:szCs w:val="28"/>
+          <w:lang w:val="uk-UA"/>
+        </w:rPr>
+        <w:t>scissor</w:t>
+      </w:r>
+      <w:r>
+        <w:rPr>
+          <w:rFonts w:ascii="Times New Roman" w:hAnsi="Times New Roman" w:eastAsia="Times New Roman" w:cs="Times New Roman"/>
+          <w:b w:val="1"/>
+          <w:bCs w:val="1"/>
+          <w:i w:val="0"/>
+          <w:iCs w:val="0"/>
+          <w:caps w:val="0"/>
+          <w:smallCaps w:val="0"/>
+          <w:noProof w:val="0"/>
+          <w:color w:val="000000" w:themeColor="text1" w:themeTint="FF" w:themeShade="FF"/>
+          <w:sz w:val="28"/>
+          <w:szCs w:val="28"/>
+          <w:lang w:val="uk-UA"/>
+        </w:rPr>
+        <w:t>", "</w:t>
+      </w:r>
+      <w:r>
+        <w:rPr>
+          <w:rFonts w:ascii="Times New Roman" w:hAnsi="Times New Roman" w:eastAsia="Times New Roman" w:cs="Times New Roman"/>
+          <w:b w:val="1"/>
+          <w:bCs w:val="1"/>
+          <w:i w:val="0"/>
+          <w:iCs w:val="0"/>
+          <w:caps w:val="0"/>
+          <w:smallCaps w:val="0"/>
+          <w:noProof w:val="0"/>
+          <w:color w:val="000000" w:themeColor="text1" w:themeTint="FF" w:themeShade="FF"/>
+          <w:sz w:val="28"/>
+          <w:szCs w:val="28"/>
+          <w:lang w:val="uk-UA"/>
+        </w:rPr>
+        <w:t>paper</w:t>
+      </w:r>
+      <w:r>
+        <w:rPr>
+          <w:rFonts w:ascii="Times New Roman" w:hAnsi="Times New Roman" w:eastAsia="Times New Roman" w:cs="Times New Roman"/>
+          <w:b w:val="1"/>
+          <w:bCs w:val="1"/>
+          <w:i w:val="0"/>
+          <w:iCs w:val="0"/>
+          <w:caps w:val="0"/>
+          <w:smallCaps w:val="0"/>
+          <w:noProof w:val="0"/>
+          <w:color w:val="000000" w:themeColor="text1" w:themeTint="FF" w:themeShade="FF"/>
+          <w:sz w:val="28"/>
+          <w:szCs w:val="28"/>
+          <w:lang w:val="uk-UA"/>
+        </w:rPr>
+        <w:t xml:space="preserve">"]. Наступним кроком, використовуючи модуль </w:t>
+      </w:r>
+      <w:r>
+        <w:rPr>
+          <w:rFonts w:ascii="Times New Roman" w:hAnsi="Times New Roman" w:eastAsia="Times New Roman" w:cs="Times New Roman"/>
+          <w:b w:val="1"/>
+          <w:bCs w:val="1"/>
+          <w:i w:val="0"/>
+          <w:iCs w:val="0"/>
+          <w:caps w:val="0"/>
+          <w:smallCaps w:val="0"/>
+          <w:noProof w:val="0"/>
+          <w:color w:val="000000" w:themeColor="text1" w:themeTint="FF" w:themeShade="FF"/>
+          <w:sz w:val="28"/>
+          <w:szCs w:val="28"/>
+          <w:lang w:val="en-US"/>
+        </w:rPr>
+        <w:t>random</w:t>
+      </w:r>
+      <w:r>
+        <w:rPr>
+          <w:rFonts w:ascii="Times New Roman" w:hAnsi="Times New Roman" w:eastAsia="Times New Roman" w:cs="Times New Roman"/>
+          <w:b w:val="1"/>
+          <w:bCs w:val="1"/>
+          <w:i w:val="0"/>
+          <w:iCs w:val="0"/>
+          <w:caps w:val="0"/>
+          <w:smallCaps w:val="0"/>
+          <w:noProof w:val="0"/>
+          <w:color w:val="000000" w:themeColor="text1" w:themeTint="FF" w:themeShade="FF"/>
+          <w:sz w:val="28"/>
+          <w:szCs w:val="28"/>
+          <w:lang w:val="uk-UA"/>
+        </w:rPr>
+        <w:t>,</w:t>
+      </w:r>
+      <w:r>
+        <w:rPr>
+          <w:rFonts w:ascii="Times New Roman" w:hAnsi="Times New Roman" w:eastAsia="Times New Roman" w:cs="Times New Roman"/>
+          <w:b w:val="1"/>
+          <w:bCs w:val="1"/>
+          <w:i w:val="0"/>
+          <w:iCs w:val="0"/>
+          <w:caps w:val="0"/>
+          <w:smallCaps w:val="0"/>
+          <w:noProof w:val="0"/>
+          <w:color w:val="000000" w:themeColor="text1" w:themeTint="FF" w:themeShade="FF"/>
+          <w:sz w:val="28"/>
+          <w:szCs w:val="28"/>
+          <w:lang w:val="ru-RU"/>
+        </w:rPr>
+        <w:t xml:space="preserve"> </w:t>
+      </w:r>
+      <w:r>
+        <w:rPr>
+          <w:rFonts w:ascii="Times New Roman" w:hAnsi="Times New Roman" w:eastAsia="Times New Roman" w:cs="Times New Roman"/>
+          <w:b w:val="1"/>
+          <w:bCs w:val="1"/>
+          <w:i w:val="0"/>
+          <w:iCs w:val="0"/>
+          <w:caps w:val="0"/>
+          <w:smallCaps w:val="0"/>
+          <w:noProof w:val="0"/>
+          <w:color w:val="000000" w:themeColor="text1" w:themeTint="FF" w:themeShade="FF"/>
+          <w:sz w:val="28"/>
+          <w:szCs w:val="28"/>
+          <w:lang w:val="uk-UA"/>
+        </w:rPr>
+        <w:t>програма у випадковому порядку вибирає одне із значень ["</w:t>
+      </w:r>
+      <w:r>
+        <w:rPr>
+          <w:rFonts w:ascii="Times New Roman" w:hAnsi="Times New Roman" w:eastAsia="Times New Roman" w:cs="Times New Roman"/>
+          <w:b w:val="1"/>
+          <w:bCs w:val="1"/>
+          <w:i w:val="0"/>
+          <w:iCs w:val="0"/>
+          <w:caps w:val="0"/>
+          <w:smallCaps w:val="0"/>
+          <w:noProof w:val="0"/>
+          <w:color w:val="000000" w:themeColor="text1" w:themeTint="FF" w:themeShade="FF"/>
+          <w:sz w:val="28"/>
+          <w:szCs w:val="28"/>
+          <w:lang w:val="uk-UA"/>
+        </w:rPr>
+        <w:t>stone</w:t>
+      </w:r>
+      <w:r>
+        <w:rPr>
+          <w:rFonts w:ascii="Times New Roman" w:hAnsi="Times New Roman" w:eastAsia="Times New Roman" w:cs="Times New Roman"/>
+          <w:b w:val="1"/>
+          <w:bCs w:val="1"/>
+          <w:i w:val="0"/>
+          <w:iCs w:val="0"/>
+          <w:caps w:val="0"/>
+          <w:smallCaps w:val="0"/>
+          <w:noProof w:val="0"/>
+          <w:color w:val="000000" w:themeColor="text1" w:themeTint="FF" w:themeShade="FF"/>
+          <w:sz w:val="28"/>
+          <w:szCs w:val="28"/>
+          <w:lang w:val="uk-UA"/>
+        </w:rPr>
+        <w:t>", "</w:t>
+      </w:r>
+      <w:r>
+        <w:rPr>
+          <w:rFonts w:ascii="Times New Roman" w:hAnsi="Times New Roman" w:eastAsia="Times New Roman" w:cs="Times New Roman"/>
+          <w:b w:val="1"/>
+          <w:bCs w:val="1"/>
+          <w:i w:val="0"/>
+          <w:iCs w:val="0"/>
+          <w:caps w:val="0"/>
+          <w:smallCaps w:val="0"/>
+          <w:noProof w:val="0"/>
+          <w:color w:val="000000" w:themeColor="text1" w:themeTint="FF" w:themeShade="FF"/>
+          <w:sz w:val="28"/>
+          <w:szCs w:val="28"/>
+          <w:lang w:val="uk-UA"/>
+        </w:rPr>
+        <w:t>scissor</w:t>
+      </w:r>
+      <w:r>
+        <w:rPr>
+          <w:rFonts w:ascii="Times New Roman" w:hAnsi="Times New Roman" w:eastAsia="Times New Roman" w:cs="Times New Roman"/>
+          <w:b w:val="1"/>
+          <w:bCs w:val="1"/>
+          <w:i w:val="0"/>
+          <w:iCs w:val="0"/>
+          <w:caps w:val="0"/>
+          <w:smallCaps w:val="0"/>
+          <w:noProof w:val="0"/>
+          <w:color w:val="000000" w:themeColor="text1" w:themeTint="FF" w:themeShade="FF"/>
+          <w:sz w:val="28"/>
+          <w:szCs w:val="28"/>
+          <w:lang w:val="uk-UA"/>
+        </w:rPr>
+        <w:t>", "</w:t>
+      </w:r>
+      <w:r>
+        <w:rPr>
+          <w:rFonts w:ascii="Times New Roman" w:hAnsi="Times New Roman" w:eastAsia="Times New Roman" w:cs="Times New Roman"/>
+          <w:b w:val="1"/>
+          <w:bCs w:val="1"/>
+          <w:i w:val="0"/>
+          <w:iCs w:val="0"/>
+          <w:caps w:val="0"/>
+          <w:smallCaps w:val="0"/>
+          <w:noProof w:val="0"/>
+          <w:color w:val="000000" w:themeColor="text1" w:themeTint="FF" w:themeShade="FF"/>
+          <w:sz w:val="28"/>
+          <w:szCs w:val="28"/>
+          <w:lang w:val="uk-UA"/>
+        </w:rPr>
+        <w:t>paper</w:t>
+      </w:r>
+      <w:r>
+        <w:rPr>
+          <w:rFonts w:ascii="Times New Roman" w:hAnsi="Times New Roman" w:eastAsia="Times New Roman" w:cs="Times New Roman"/>
+          <w:b w:val="1"/>
+          <w:bCs w:val="1"/>
+          <w:i w:val="0"/>
+          <w:iCs w:val="0"/>
+          <w:caps w:val="0"/>
+          <w:smallCaps w:val="0"/>
+          <w:noProof w:val="0"/>
+          <w:color w:val="000000" w:themeColor="text1" w:themeTint="FF" w:themeShade="FF"/>
+          <w:sz w:val="28"/>
+          <w:szCs w:val="28"/>
+          <w:lang w:val="uk-UA"/>
+        </w:rPr>
+        <w:t>"]. В залежності від умови, що камінь перемагає ножиці, ножиці перемагають папір, а папір перемагає камінь визначити переможця.</w:t>
+      </w:r>
+    </w:p>
+    <w:p>
+      <w:pPr>
+        <w:pStyle w:val="Normal"/>
+      </w:pPr>
+      <w:r>
+        <w:rPr>
+          <w:noProof w:val="0"/>
+          <w:lang w:val="uk-UA"/>
+        </w:rPr>
+        <w:t>Хід виконання завдання</w:t>
+      </w:r>
+    </w:p>
+    <w:p>
+      <w:pPr>
+        <w:pStyle w:val="Normal"/>
+      </w:pPr>
+      <w:r>
+        <w:rPr>
+          <w:noProof w:val="0"/>
+          <w:lang w:val="uk-UA"/>
+        </w:rPr>
+        <w:t xml:space="preserve">Спочатку було підключено модуль </w:t>
+      </w:r>
+      <w:r>
+        <w:rPr>
+          <w:noProof w:val="0"/>
+          <w:lang w:val="uk-UA"/>
+        </w:rPr>
+        <w:t>random</w:t>
+      </w:r>
+      <w:r>
+        <w:rPr>
+          <w:noProof w:val="0"/>
+          <w:lang w:val="uk-UA"/>
+        </w:rPr>
+        <w:t xml:space="preserve">, який дозволяє здійснювати випадковий вибір елементів. Далі було створено список </w:t>
+      </w:r>
+      <w:r>
+        <w:rPr>
+          <w:noProof w:val="0"/>
+          <w:lang w:val="uk-UA"/>
+        </w:rPr>
+        <w:t>options</w:t>
+      </w:r>
+      <w:r>
+        <w:rPr>
+          <w:noProof w:val="0"/>
+          <w:lang w:val="uk-UA"/>
+        </w:rPr>
+        <w:t xml:space="preserve">, що містить три можливі варіанти гри: </w:t>
+      </w:r>
+      <w:r>
+        <w:rPr>
+          <w:noProof w:val="0"/>
+          <w:lang w:val="uk-UA"/>
+        </w:rPr>
+        <w:t>stone</w:t>
+      </w:r>
+      <w:r>
+        <w:rPr>
+          <w:noProof w:val="0"/>
+          <w:lang w:val="uk-UA"/>
+        </w:rPr>
+        <w:t xml:space="preserve">, </w:t>
+      </w:r>
+      <w:r>
+        <w:rPr>
+          <w:noProof w:val="0"/>
+          <w:lang w:val="uk-UA"/>
+        </w:rPr>
+        <w:t>scissor</w:t>
+      </w:r>
+      <w:r>
+        <w:rPr>
+          <w:noProof w:val="0"/>
+          <w:lang w:val="uk-UA"/>
+        </w:rPr>
+        <w:t xml:space="preserve"> та </w:t>
+      </w:r>
+      <w:r>
+        <w:rPr>
+          <w:noProof w:val="0"/>
+          <w:lang w:val="uk-UA"/>
+        </w:rPr>
+        <w:t>paper</w:t>
+      </w:r>
+      <w:r>
+        <w:rPr>
+          <w:noProof w:val="0"/>
+          <w:lang w:val="uk-UA"/>
+        </w:rPr>
+        <w:t>.</w:t>
+      </w:r>
+    </w:p>
+    <w:p>
+      <w:pPr>
+        <w:pStyle w:val="Normal"/>
+      </w:pPr>
+      <w:r>
+        <w:rPr>
+          <w:noProof w:val="0"/>
+          <w:lang w:val="uk-UA"/>
+        </w:rPr>
+        <w:t xml:space="preserve">За допомогою функції </w:t>
+      </w:r>
+      <w:r>
+        <w:rPr>
+          <w:noProof w:val="0"/>
+          <w:lang w:val="uk-UA"/>
+        </w:rPr>
+        <w:t>input()</w:t>
+      </w:r>
+      <w:r>
+        <w:rPr>
+          <w:noProof w:val="0"/>
+          <w:lang w:val="uk-UA"/>
+        </w:rPr>
+        <w:t xml:space="preserve"> користувач вводить свій вибір, який зберігається у змінній </w:t>
+      </w:r>
+      <w:r>
+        <w:rPr>
+          <w:noProof w:val="0"/>
+          <w:lang w:val="uk-UA"/>
+        </w:rPr>
+        <w:t>PlayerAnswer</w:t>
+      </w:r>
+      <w:r>
+        <w:rPr>
+          <w:noProof w:val="0"/>
+          <w:lang w:val="uk-UA"/>
+        </w:rPr>
+        <w:t xml:space="preserve">. Для визначення вибору комп’ютера використовується функція </w:t>
+      </w:r>
+      <w:r>
+        <w:rPr>
+          <w:noProof w:val="0"/>
+          <w:lang w:val="uk-UA"/>
+        </w:rPr>
+        <w:t>random.choice(options)</w:t>
+      </w:r>
+      <w:r>
+        <w:rPr>
+          <w:noProof w:val="0"/>
+          <w:lang w:val="uk-UA"/>
+        </w:rPr>
+        <w:t xml:space="preserve">, яка випадковим чином обирає один із трьох елементів списку та зберігає його у змінній </w:t>
+      </w:r>
+      <w:r>
+        <w:rPr>
+          <w:noProof w:val="0"/>
+          <w:lang w:val="uk-UA"/>
+        </w:rPr>
+        <w:t>computer</w:t>
+      </w:r>
+      <w:r>
+        <w:rPr>
+          <w:noProof w:val="0"/>
+          <w:lang w:val="uk-UA"/>
+        </w:rPr>
+        <w:t>.</w:t>
+      </w:r>
+    </w:p>
+    <w:p>
+      <w:pPr>
+        <w:pStyle w:val="Normal"/>
+      </w:pPr>
+      <w:r>
+        <w:rPr>
+          <w:noProof w:val="0"/>
+          <w:lang w:val="uk-UA"/>
+        </w:rPr>
+        <w:t xml:space="preserve">Після цього за допомогою умовного оператора </w:t>
+      </w:r>
+      <w:r>
+        <w:rPr>
+          <w:noProof w:val="0"/>
+          <w:lang w:val="uk-UA"/>
+        </w:rPr>
+        <w:t>if</w:t>
+      </w:r>
+      <w:r>
+        <w:rPr>
+          <w:noProof w:val="0"/>
+          <w:lang w:val="uk-UA"/>
+        </w:rPr>
+        <w:t xml:space="preserve"> виконується перевірка правильності введених користувачем даних. Якщо введене значення відсутнє у списку </w:t>
+      </w:r>
+      <w:r>
+        <w:rPr>
+          <w:noProof w:val="0"/>
+          <w:lang w:val="uk-UA"/>
+        </w:rPr>
+        <w:t>options</w:t>
+      </w:r>
+      <w:r>
+        <w:rPr>
+          <w:noProof w:val="0"/>
+          <w:lang w:val="uk-UA"/>
+        </w:rPr>
+        <w:t xml:space="preserve">, програма виводить повідомлення </w:t>
+      </w:r>
+      <w:r>
+        <w:rPr>
+          <w:noProof w:val="0"/>
+          <w:lang w:val="uk-UA"/>
+        </w:rPr>
+        <w:t>Wrong operation</w:t>
+      </w:r>
+      <w:r>
+        <w:rPr>
+          <w:noProof w:val="0"/>
+          <w:lang w:val="uk-UA"/>
+        </w:rPr>
+        <w:t>. У протилежному випадку на екран виводиться вибір комп’ютера.</w:t>
+      </w:r>
+    </w:p>
+    <w:p>
+      <w:pPr>
+        <w:pStyle w:val="Normal"/>
+      </w:pPr>
+      <w:r>
+        <w:rPr>
+          <w:noProof w:val="0"/>
+          <w:lang w:val="uk-UA"/>
+        </w:rPr>
+        <w:t xml:space="preserve">Для визначення переможця було використано конструкцію </w:t>
+      </w:r>
+      <w:r>
+        <w:rPr>
+          <w:noProof w:val="0"/>
+          <w:lang w:val="uk-UA"/>
+        </w:rPr>
+        <w:t>if elif else</w:t>
+      </w:r>
+      <w:r>
+        <w:rPr>
+          <w:noProof w:val="0"/>
+          <w:lang w:val="uk-UA"/>
+        </w:rPr>
+        <w:t xml:space="preserve">. Якщо вибір користувача та комп’ютера збігається, програма виводить повідомлення </w:t>
+      </w:r>
+      <w:r>
+        <w:rPr>
+          <w:noProof w:val="0"/>
+          <w:lang w:val="uk-UA"/>
+        </w:rPr>
+        <w:t>Draw</w:t>
+      </w:r>
+      <w:r>
+        <w:rPr>
+          <w:noProof w:val="0"/>
+          <w:lang w:val="uk-UA"/>
+        </w:rPr>
+        <w:t xml:space="preserve">, що означає нічию. За допомогою оператора </w:t>
+      </w:r>
+      <w:r>
+        <w:rPr>
+          <w:noProof w:val="0"/>
+          <w:lang w:val="uk-UA"/>
+        </w:rPr>
+        <w:t>elif</w:t>
+      </w:r>
+      <w:r>
+        <w:rPr>
+          <w:noProof w:val="0"/>
+          <w:lang w:val="uk-UA"/>
+        </w:rPr>
+        <w:t xml:space="preserve"> перевіряються три можливі умови перемоги користувача: камінь перемагає ножиці, ножиці перемагають папір, а папір перемагає камінь. Якщо виконується одна із цих умов, виводиться повідомлення </w:t>
+      </w:r>
+      <w:r>
+        <w:rPr>
+          <w:noProof w:val="0"/>
+          <w:lang w:val="uk-UA"/>
+        </w:rPr>
+        <w:t>You win</w:t>
+      </w:r>
+      <w:r>
+        <w:rPr>
+          <w:noProof w:val="0"/>
+          <w:lang w:val="uk-UA"/>
+        </w:rPr>
+        <w:t xml:space="preserve">. В інших випадках програма повідомляє про перемогу комп’ютера за допомогою </w:t>
+      </w:r>
+      <w:r>
+        <w:rPr>
+          <w:noProof w:val="0"/>
+          <w:lang w:val="uk-UA"/>
+        </w:rPr>
+        <w:t>Computer wins</w:t>
+      </w:r>
+      <w:r>
+        <w:rPr>
+          <w:noProof w:val="0"/>
+          <w:lang w:val="uk-UA"/>
+        </w:rPr>
+        <w:t>.</w:t>
+      </w:r>
+    </w:p>
+    <w:p>
+      <w:pPr>
+        <w:pStyle w:val="Normal"/>
+      </w:pPr>
+      <w:r>
+        <w:rPr>
+          <w:noProof w:val="0"/>
+          <w:lang w:val="uk-UA"/>
+        </w:rPr>
+        <w:t>Таким чином, було реалізовано гру «Камінь, ножиці, папір», у якій користувач може обрати один із трьох варіантів, комп’ютер здійснює випадковий вибір, а програма порівнює отримані значення та визначає результат гри.</w:t>
+      </w:r>
+    </w:p>
+    <w:p>
+      <w:pPr>
+        <w:pStyle w:val="Normal"/>
+      </w:pPr>
+      <w:r>
+        <w:rPr>
+          <w:lang w:val="uk-UA"/>
+        </w:rPr>
+        <w:t>Текст програми:</w:t>
+      </w:r>
+    </w:p>
+    <w:p>
+      <w:pPr>
+        <w:pStyle w:val="Normal"/>
+        <w:ind w:firstLine="0"/>
+      </w:pPr>
+      <w:r>
+        <w:drawing>
+          <wp:inline wp14:editId="5577B916" wp14:anchorId="313243E4">
+            <wp:extent cx="5943600" cy="1847850"/>
+            <wp:effectExtent l="0" t="0" r="0" b="0"/>
+            <wp:docPr id="1241690333" name="drawing"/>
+            <wp:cNvGraphicFramePr>
+              <a:graphicFrameLocks noChangeAspect="1"/>
+            </wp:cNvGraphicFramePr>
+            <a:graphic>
+              <a:graphicData xmlns:a="http://schemas.openxmlformats.org/drawingml/2006/main" uri="http://schemas.openxmlformats.org/drawingml/2006/picture">
+                <pic:pic xmlns:pic="http://schemas.openxmlformats.org/drawingml/2006/picture">
+                  <pic:nvPicPr>
+                    <pic:cNvPr id="1241690333" name="Picture 1241690333"/>
+                    <pic:cNvPicPr/>
+                  </pic:nvPicPr>
+                  <pic:blipFill>
+                    <a:blip xmlns:r="http://schemas.openxmlformats.org/officeDocument/2006/relationships" r:embed="rId979639074">
+                      <a:extLst>
+                        <a:ext uri="{28A0092B-C50C-407E-A947-70E740481C1C}">
+                          <a14:useLocalDpi xmlns:a14="http://schemas.microsoft.com/office/drawing/2010/main"/>
+                        </a:ext>
+                      </a:extLst>
+                    </a:blip>
+                    <a:stretch>
+                      <a:fillRect/>
+                    </a:stretch>
+                  </pic:blipFill>
+                  <pic:spPr>
+                    <a:xfrm>
+                      <a:off x="0" y="0"/>
+                      <a:ext cx="5943600" cy="1847850"/>
+                    </a:xfrm>
+                    <a:prstGeom prst="rect">
+                      <a:avLst/>
+                    </a:prstGeom>
+                  </pic:spPr>
+                </pic:pic>
+              </a:graphicData>
+            </a:graphic>
+          </wp:inline>
+        </w:drawing>
+      </w:r>
+      <w:r>
+        <w:tab/>
+      </w:r>
+      <w:r>
+        <w:rPr>
+          <w:lang w:val="uk-UA"/>
+        </w:rPr>
+        <w:t xml:space="preserve">Посилання на </w:t>
+      </w:r>
+      <w:r>
+        <w:rPr/>
+        <w:t>github</w:t>
+      </w:r>
+      <w:r>
+        <w:rPr>
+          <w:lang w:val="ru-RU"/>
+        </w:rPr>
+        <w:t>:</w:t>
+      </w:r>
+      <w:r>
+        <w:rPr>
+          <w:lang w:val="ru-RU"/>
+        </w:rPr>
+        <w:t xml:space="preserve"> </w:t>
+      </w:r>
+      <w:r>
+        <w:rPr>
+          <w:lang w:val="ru-RU"/>
+        </w:rPr>
+        <w:t>https://github.com/igor231083-cmd/TP-KB-251-Igor-Kharcenko/blob/main/Topic_05/test01.py</w:t>
+      </w:r>
+    </w:p>
+    <w:p>
+      <w:pPr>
+        <w:pStyle w:val="Normal"/>
+      </w:pPr>
+      <w:r>
+        <w:rPr>
+          <w:lang w:val="uk-UA"/>
+        </w:rPr>
+        <w:t xml:space="preserve">Знімок екрану з посилання на </w:t>
+      </w:r>
+      <w:r>
+        <w:rPr/>
+        <w:t>github</w:t>
+      </w:r>
+      <w:r>
+        <w:rPr/>
+        <w:t>:</w:t>
+      </w:r>
+    </w:p>
+    <w:p>
+      <w:pPr>
+        <w:pStyle w:val="Normal"/>
+        <w:spacing w:line="360" w:lineRule="auto"/>
+        <w:ind w:firstLine="0"/>
+        <w:jc w:val="both"/>
+        <w:rPr>
+          <w:rFonts w:ascii="Times New Roman" w:hAnsi="Times New Roman" w:eastAsia="Times New Roman" w:cs="Times New Roman"/>
+          <w:b w:val="1"/>
+          <w:bCs w:val="1"/>
+          <w:noProof w:val="0"/>
+          <w:sz w:val="28"/>
+          <w:szCs w:val="28"/>
+          <w:lang w:val="en-US"/>
+        </w:rPr>
+      </w:pPr>
+      <w:r>
+        <w:drawing>
+          <wp:inline wp14:editId="6011FFB1" wp14:anchorId="2C0B7A20">
+            <wp:extent cx="5943600" cy="2752725"/>
+            <wp:effectExtent l="0" t="0" r="0" b="0"/>
+            <wp:docPr id="1837708377" name="drawing"/>
+            <wp:cNvGraphicFramePr>
+              <a:graphicFrameLocks noChangeAspect="1"/>
+            </wp:cNvGraphicFramePr>
+            <a:graphic>
+              <a:graphicData xmlns:a="http://schemas.openxmlformats.org/drawingml/2006/main" uri="http://schemas.openxmlformats.org/drawingml/2006/picture">
+                <pic:pic xmlns:pic="http://schemas.openxmlformats.org/drawingml/2006/picture">
+                  <pic:nvPicPr>
+                    <pic:cNvPr id="1837708377" name="Picture 1837708377"/>
+                    <pic:cNvPicPr/>
+                  </pic:nvPicPr>
+                  <pic:blipFill>
+                    <a:blip xmlns:r="http://schemas.openxmlformats.org/officeDocument/2006/relationships" r:embed="rId453847068">
+                      <a:extLst>
+                        <a:ext uri="{28A0092B-C50C-407E-A947-70E740481C1C}">
+                          <a14:useLocalDpi xmlns:a14="http://schemas.microsoft.com/office/drawing/2010/main"/>
+                        </a:ext>
+                      </a:extLst>
+                    </a:blip>
+                    <a:stretch>
+                      <a:fillRect/>
+                    </a:stretch>
+                  </pic:blipFill>
+                  <pic:spPr>
+                    <a:xfrm>
+                      <a:off x="0" y="0"/>
+                      <a:ext cx="5943600" cy="2752725"/>
+                    </a:xfrm>
+                    <a:prstGeom prst="rect">
+                      <a:avLst/>
+                    </a:prstGeom>
+                  </pic:spPr>
+                </pic:pic>
+              </a:graphicData>
+            </a:graphic>
+          </wp:inline>
+        </w:drawing>
+      </w:r>
+      <w:r>
+        <w:tab/>
+      </w:r>
+      <w:r>
+        <w:rPr>
+          <w:rFonts w:ascii="Times New Roman" w:hAnsi="Times New Roman" w:eastAsia="Times New Roman" w:cs="Times New Roman"/>
+          <w:b w:val="1"/>
+          <w:bCs w:val="1"/>
+          <w:i w:val="0"/>
+          <w:iCs w:val="0"/>
+          <w:caps w:val="0"/>
+          <w:smallCaps w:val="0"/>
+          <w:noProof w:val="0"/>
+          <w:color w:val="000000" w:themeColor="text1" w:themeTint="FF" w:themeShade="FF"/>
+          <w:sz w:val="28"/>
+          <w:szCs w:val="28"/>
+          <w:lang w:val="uk-UA"/>
+        </w:rPr>
+        <w:t xml:space="preserve">Програма конвертування іноземної валюти в українську гривню. Для отримання актуальних курсів валют необхідно використовувати </w:t>
+      </w:r>
+      <w:r>
+        <w:rPr>
+          <w:rFonts w:ascii="Times New Roman" w:hAnsi="Times New Roman" w:eastAsia="Times New Roman" w:cs="Times New Roman"/>
+          <w:b w:val="1"/>
+          <w:bCs w:val="1"/>
+          <w:i w:val="0"/>
+          <w:iCs w:val="0"/>
+          <w:caps w:val="0"/>
+          <w:smallCaps w:val="0"/>
+          <w:noProof w:val="0"/>
+          <w:color w:val="000000" w:themeColor="text1" w:themeTint="FF" w:themeShade="FF"/>
+          <w:sz w:val="28"/>
+          <w:szCs w:val="28"/>
+          <w:lang w:val="en-US"/>
+        </w:rPr>
+        <w:t>API</w:t>
+      </w:r>
+      <w:r>
+        <w:rPr>
+          <w:rFonts w:ascii="Times New Roman" w:hAnsi="Times New Roman" w:eastAsia="Times New Roman" w:cs="Times New Roman"/>
+          <w:b w:val="1"/>
+          <w:bCs w:val="1"/>
+          <w:i w:val="0"/>
+          <w:iCs w:val="0"/>
+          <w:caps w:val="0"/>
+          <w:smallCaps w:val="0"/>
+          <w:noProof w:val="0"/>
+          <w:color w:val="000000" w:themeColor="text1" w:themeTint="FF" w:themeShade="FF"/>
+          <w:sz w:val="28"/>
+          <w:szCs w:val="28"/>
+          <w:lang w:val="ru-RU"/>
+        </w:rPr>
+        <w:t xml:space="preserve"> </w:t>
+      </w:r>
+      <w:r>
+        <w:rPr>
+          <w:rFonts w:ascii="Times New Roman" w:hAnsi="Times New Roman" w:eastAsia="Times New Roman" w:cs="Times New Roman"/>
+          <w:b w:val="1"/>
+          <w:bCs w:val="1"/>
+          <w:i w:val="0"/>
+          <w:iCs w:val="0"/>
+          <w:caps w:val="0"/>
+          <w:smallCaps w:val="0"/>
+          <w:noProof w:val="0"/>
+          <w:color w:val="000000" w:themeColor="text1" w:themeTint="FF" w:themeShade="FF"/>
+          <w:sz w:val="28"/>
+          <w:szCs w:val="28"/>
+          <w:lang w:val="uk-UA"/>
+        </w:rPr>
+        <w:t xml:space="preserve">НБУ та модуль, що надає можливість виконувати запити до сторонніх сервісів requests. Достатня умова роботи – можливість конвертації для трьох іноземних валют </w:t>
+      </w:r>
+      <w:r>
+        <w:rPr>
+          <w:rFonts w:ascii="Times New Roman" w:hAnsi="Times New Roman" w:eastAsia="Times New Roman" w:cs="Times New Roman"/>
+          <w:b w:val="1"/>
+          <w:bCs w:val="1"/>
+          <w:i w:val="0"/>
+          <w:iCs w:val="0"/>
+          <w:caps w:val="0"/>
+          <w:smallCaps w:val="0"/>
+          <w:noProof w:val="0"/>
+          <w:color w:val="000000" w:themeColor="text1" w:themeTint="FF" w:themeShade="FF"/>
+          <w:sz w:val="28"/>
+          <w:szCs w:val="28"/>
+          <w:lang w:val="en-US"/>
+        </w:rPr>
+        <w:t>EUR</w:t>
+      </w:r>
+      <w:r>
+        <w:rPr>
+          <w:rFonts w:ascii="Times New Roman" w:hAnsi="Times New Roman" w:eastAsia="Times New Roman" w:cs="Times New Roman"/>
+          <w:b w:val="1"/>
+          <w:bCs w:val="1"/>
+          <w:i w:val="0"/>
+          <w:iCs w:val="0"/>
+          <w:caps w:val="0"/>
+          <w:smallCaps w:val="0"/>
+          <w:noProof w:val="0"/>
+          <w:color w:val="000000" w:themeColor="text1" w:themeTint="FF" w:themeShade="FF"/>
+          <w:sz w:val="28"/>
+          <w:szCs w:val="28"/>
+          <w:lang w:val="uk-UA"/>
+        </w:rPr>
+        <w:t xml:space="preserve">, </w:t>
+      </w:r>
+      <w:r>
+        <w:rPr>
+          <w:rFonts w:ascii="Times New Roman" w:hAnsi="Times New Roman" w:eastAsia="Times New Roman" w:cs="Times New Roman"/>
+          <w:b w:val="1"/>
+          <w:bCs w:val="1"/>
+          <w:i w:val="0"/>
+          <w:iCs w:val="0"/>
+          <w:caps w:val="0"/>
+          <w:smallCaps w:val="0"/>
+          <w:noProof w:val="0"/>
+          <w:color w:val="000000" w:themeColor="text1" w:themeTint="FF" w:themeShade="FF"/>
+          <w:sz w:val="28"/>
+          <w:szCs w:val="28"/>
+          <w:lang w:val="en-US"/>
+        </w:rPr>
+        <w:t>USD</w:t>
+      </w:r>
+      <w:r>
+        <w:rPr>
+          <w:rFonts w:ascii="Times New Roman" w:hAnsi="Times New Roman" w:eastAsia="Times New Roman" w:cs="Times New Roman"/>
+          <w:b w:val="1"/>
+          <w:bCs w:val="1"/>
+          <w:i w:val="0"/>
+          <w:iCs w:val="0"/>
+          <w:caps w:val="0"/>
+          <w:smallCaps w:val="0"/>
+          <w:noProof w:val="0"/>
+          <w:color w:val="000000" w:themeColor="text1" w:themeTint="FF" w:themeShade="FF"/>
+          <w:sz w:val="28"/>
+          <w:szCs w:val="28"/>
+          <w:lang w:val="uk-UA"/>
+        </w:rPr>
+        <w:t xml:space="preserve">, </w:t>
+      </w:r>
+      <w:r>
+        <w:rPr>
+          <w:rFonts w:ascii="Times New Roman" w:hAnsi="Times New Roman" w:eastAsia="Times New Roman" w:cs="Times New Roman"/>
+          <w:b w:val="1"/>
+          <w:bCs w:val="1"/>
+          <w:i w:val="0"/>
+          <w:iCs w:val="0"/>
+          <w:caps w:val="0"/>
+          <w:smallCaps w:val="0"/>
+          <w:noProof w:val="0"/>
+          <w:color w:val="000000" w:themeColor="text1" w:themeTint="FF" w:themeShade="FF"/>
+          <w:sz w:val="28"/>
+          <w:szCs w:val="28"/>
+          <w:lang w:val="en-US"/>
+        </w:rPr>
+        <w:t>PLN</w:t>
+      </w:r>
+      <w:r>
+        <w:rPr>
+          <w:rFonts w:ascii="Times New Roman" w:hAnsi="Times New Roman" w:eastAsia="Times New Roman" w:cs="Times New Roman"/>
+          <w:b w:val="1"/>
+          <w:bCs w:val="1"/>
+          <w:i w:val="0"/>
+          <w:iCs w:val="0"/>
+          <w:caps w:val="0"/>
+          <w:smallCaps w:val="0"/>
+          <w:noProof w:val="0"/>
+          <w:color w:val="000000" w:themeColor="text1" w:themeTint="FF" w:themeShade="FF"/>
+          <w:sz w:val="28"/>
+          <w:szCs w:val="28"/>
+          <w:lang w:val="uk-UA"/>
+        </w:rPr>
+        <w:t>. Користувачу надається можливість введення кількості та типу валюти, результат роботи програми – конвертоване значення в українських гривнях.</w:t>
+      </w:r>
+    </w:p>
+    <w:p>
+      <w:pPr>
+        <w:pStyle w:val="Normal"/>
+        <w:ind w:firstLine="720"/>
+      </w:pPr>
+      <w:r>
+        <w:rPr>
+          <w:noProof w:val="0"/>
+          <w:lang w:val="en-US"/>
+        </w:rPr>
+        <w:t xml:space="preserve">Хід </w:t>
+      </w:r>
+      <w:r>
+        <w:rPr>
+          <w:noProof w:val="0"/>
+          <w:lang w:val="en-US"/>
+        </w:rPr>
+        <w:t>виконання</w:t>
+      </w:r>
+      <w:r>
+        <w:rPr>
+          <w:noProof w:val="0"/>
+          <w:lang w:val="en-US"/>
+        </w:rPr>
+        <w:t xml:space="preserve"> </w:t>
+      </w:r>
+      <w:r>
+        <w:rPr>
+          <w:noProof w:val="0"/>
+          <w:lang w:val="en-US"/>
+        </w:rPr>
+        <w:t>завдання</w:t>
+      </w:r>
+    </w:p>
+    <w:p>
+      <w:pPr>
+        <w:pStyle w:val="Normal"/>
+      </w:pPr>
+      <w:r>
+        <w:rPr>
+          <w:noProof w:val="0"/>
+          <w:lang w:val="en-US"/>
+        </w:rPr>
+        <w:t>Для виконання завдання було розроблено програму мовою Python, яка дозволяє конвертувати іноземну валюту в українську гривню з використанням актуальних курсів Національного банку України.</w:t>
+      </w:r>
+    </w:p>
+    <w:p>
+      <w:pPr>
+        <w:pStyle w:val="Normal"/>
+      </w:pPr>
+      <w:r>
+        <w:rPr>
+          <w:noProof w:val="0"/>
+          <w:lang w:val="en-US"/>
+        </w:rPr>
+        <w:t xml:space="preserve">Спочатку було підключено модуль </w:t>
+      </w:r>
+      <w:r>
+        <w:rPr>
+          <w:noProof w:val="0"/>
+          <w:lang w:val="en-US"/>
+        </w:rPr>
+        <w:t>requests</w:t>
+      </w:r>
+      <w:r>
+        <w:rPr>
+          <w:noProof w:val="0"/>
+          <w:lang w:val="en-US"/>
+        </w:rPr>
+        <w:t xml:space="preserve">, який дозволяє виконувати HTTP-запити до сторонніх сервісів. За допомогою функції </w:t>
+      </w:r>
+      <w:r>
+        <w:rPr>
+          <w:noProof w:val="0"/>
+          <w:lang w:val="en-US"/>
+        </w:rPr>
+        <w:t>requests.get()</w:t>
+      </w:r>
+      <w:r>
+        <w:rPr>
+          <w:noProof w:val="0"/>
+          <w:lang w:val="en-US"/>
+        </w:rPr>
+        <w:t xml:space="preserve"> було здійснено запит до API НБУ для отримання офіційних курсів іноземних валют. Отримана відповідь зберігається у змінній </w:t>
+      </w:r>
+      <w:r>
+        <w:rPr>
+          <w:noProof w:val="0"/>
+          <w:lang w:val="en-US"/>
+        </w:rPr>
+        <w:t>response</w:t>
+      </w:r>
+      <w:r>
+        <w:rPr>
+          <w:noProof w:val="0"/>
+          <w:lang w:val="en-US"/>
+        </w:rPr>
+        <w:t>.</w:t>
+      </w:r>
+    </w:p>
+    <w:p>
+      <w:pPr>
+        <w:pStyle w:val="Normal"/>
+      </w:pPr>
+      <w:r>
+        <w:rPr>
+          <w:noProof w:val="0"/>
+          <w:lang w:val="en-US"/>
+        </w:rPr>
+        <w:t xml:space="preserve">Для забезпечення багаторазового виконання конвертації було використано цикл </w:t>
+      </w:r>
+      <w:r>
+        <w:rPr>
+          <w:noProof w:val="0"/>
+          <w:lang w:val="en-US"/>
+        </w:rPr>
+        <w:t>while True</w:t>
+      </w:r>
+      <w:r>
+        <w:rPr>
+          <w:noProof w:val="0"/>
+          <w:lang w:val="en-US"/>
+        </w:rPr>
+        <w:t xml:space="preserve">. За допомогою функції </w:t>
+      </w:r>
+      <w:r>
+        <w:rPr>
+          <w:noProof w:val="0"/>
+          <w:lang w:val="en-US"/>
+        </w:rPr>
+        <w:t>input()</w:t>
+      </w:r>
+      <w:r>
+        <w:rPr>
+          <w:noProof w:val="0"/>
+          <w:lang w:val="en-US"/>
+        </w:rPr>
+        <w:t xml:space="preserve"> користувач вводить тип валюти, яку необхідно конвертувати. Метод </w:t>
+      </w:r>
+      <w:r>
+        <w:rPr>
+          <w:noProof w:val="0"/>
+          <w:lang w:val="en-US"/>
+        </w:rPr>
+        <w:t>upper()</w:t>
+      </w:r>
+      <w:r>
+        <w:rPr>
+          <w:noProof w:val="0"/>
+          <w:lang w:val="en-US"/>
+        </w:rPr>
+        <w:t xml:space="preserve"> перетворює введене значення у верхній регістр, що дозволяє вводити назви валют незалежно від регістру літер.</w:t>
+      </w:r>
+    </w:p>
+    <w:p>
+      <w:pPr>
+        <w:pStyle w:val="Normal"/>
+      </w:pPr>
+      <w:r>
+        <w:rPr>
+          <w:noProof w:val="0"/>
+          <w:lang w:val="en-US"/>
+        </w:rPr>
+        <w:t xml:space="preserve">Далі за допомогою умовного оператора </w:t>
+      </w:r>
+      <w:r>
+        <w:rPr>
+          <w:noProof w:val="0"/>
+          <w:lang w:val="en-US"/>
+        </w:rPr>
+        <w:t>if</w:t>
+      </w:r>
+      <w:r>
+        <w:rPr>
+          <w:noProof w:val="0"/>
+          <w:lang w:val="en-US"/>
+        </w:rPr>
+        <w:t xml:space="preserve"> виконується перевірка введеної валюти. Якщо користувач вводить символ </w:t>
+      </w:r>
+      <w:r>
+        <w:rPr>
+          <w:noProof w:val="0"/>
+          <w:lang w:val="en-US"/>
+        </w:rPr>
+        <w:t>Q</w:t>
+      </w:r>
+      <w:r>
+        <w:rPr>
+          <w:noProof w:val="0"/>
+          <w:lang w:val="en-US"/>
+        </w:rPr>
+        <w:t xml:space="preserve">, програма завершує роботу за допомогою </w:t>
+      </w:r>
+      <w:r>
+        <w:rPr>
+          <w:noProof w:val="0"/>
+          <w:lang w:val="en-US"/>
+        </w:rPr>
+        <w:t>break</w:t>
+      </w:r>
+      <w:r>
+        <w:rPr>
+          <w:noProof w:val="0"/>
+          <w:lang w:val="en-US"/>
+        </w:rPr>
+        <w:t xml:space="preserve">. Якщо введена валюта не належить до списку </w:t>
+      </w:r>
+      <w:r>
+        <w:rPr>
+          <w:noProof w:val="0"/>
+          <w:lang w:val="en-US"/>
+        </w:rPr>
+        <w:t>EUR</w:t>
+      </w:r>
+      <w:r>
+        <w:rPr>
+          <w:noProof w:val="0"/>
+          <w:lang w:val="en-US"/>
+        </w:rPr>
+        <w:t xml:space="preserve">, </w:t>
+      </w:r>
+      <w:r>
+        <w:rPr>
+          <w:noProof w:val="0"/>
+          <w:lang w:val="en-US"/>
+        </w:rPr>
+        <w:t>USD</w:t>
+      </w:r>
+      <w:r>
+        <w:rPr>
+          <w:noProof w:val="0"/>
+          <w:lang w:val="en-US"/>
+        </w:rPr>
+        <w:t xml:space="preserve">, </w:t>
+      </w:r>
+      <w:r>
+        <w:rPr>
+          <w:noProof w:val="0"/>
+          <w:lang w:val="en-US"/>
+        </w:rPr>
+        <w:t>PLN</w:t>
+      </w:r>
+      <w:r>
+        <w:rPr>
+          <w:noProof w:val="0"/>
+          <w:lang w:val="en-US"/>
+        </w:rPr>
+        <w:t xml:space="preserve">, виводиться повідомлення </w:t>
+      </w:r>
+      <w:r>
+        <w:rPr>
+          <w:noProof w:val="0"/>
+          <w:lang w:val="en-US"/>
+        </w:rPr>
+        <w:t>Wrong currency</w:t>
+      </w:r>
+      <w:r>
+        <w:rPr>
+          <w:noProof w:val="0"/>
+          <w:lang w:val="en-US"/>
+        </w:rPr>
+        <w:t xml:space="preserve">, а команда </w:t>
+      </w:r>
+      <w:r>
+        <w:rPr>
+          <w:noProof w:val="0"/>
+          <w:lang w:val="en-US"/>
+        </w:rPr>
+        <w:t>continue</w:t>
+      </w:r>
+      <w:r>
+        <w:rPr>
+          <w:noProof w:val="0"/>
+          <w:lang w:val="en-US"/>
+        </w:rPr>
+        <w:t xml:space="preserve"> повертає програму на початок циклу.</w:t>
+      </w:r>
+    </w:p>
+    <w:p>
+      <w:pPr>
+        <w:pStyle w:val="Normal"/>
+      </w:pPr>
+      <w:r>
+        <w:rPr>
+          <w:noProof w:val="0"/>
+          <w:lang w:val="en-US"/>
+        </w:rPr>
+        <w:t xml:space="preserve">Після вибору валюти користувач вводить необхідну суму за допомогою </w:t>
+      </w:r>
+      <w:r>
+        <w:rPr>
+          <w:noProof w:val="0"/>
+          <w:lang w:val="en-US"/>
+        </w:rPr>
+        <w:t>input()</w:t>
+      </w:r>
+      <w:r>
+        <w:rPr>
+          <w:noProof w:val="0"/>
+          <w:lang w:val="en-US"/>
+        </w:rPr>
+        <w:t xml:space="preserve">, яка перетворюється на ціле число функцією </w:t>
+      </w:r>
+      <w:r>
+        <w:rPr>
+          <w:noProof w:val="0"/>
+          <w:lang w:val="en-US"/>
+        </w:rPr>
+        <w:t>int()</w:t>
+      </w:r>
+      <w:r>
+        <w:rPr>
+          <w:noProof w:val="0"/>
+          <w:lang w:val="en-US"/>
+        </w:rPr>
+        <w:t>.</w:t>
+      </w:r>
+    </w:p>
+    <w:p>
+      <w:pPr>
+        <w:pStyle w:val="Normal"/>
+      </w:pPr>
+      <w:r>
+        <w:rPr>
+          <w:noProof w:val="0"/>
+          <w:lang w:val="en-US"/>
+        </w:rPr>
+        <w:t xml:space="preserve">Для пошуку відповідного курсу використовується цикл </w:t>
+      </w:r>
+      <w:r>
+        <w:rPr>
+          <w:noProof w:val="0"/>
+          <w:lang w:val="en-US"/>
+        </w:rPr>
+        <w:t>for</w:t>
+      </w:r>
+      <w:r>
+        <w:rPr>
+          <w:noProof w:val="0"/>
+          <w:lang w:val="en-US"/>
+        </w:rPr>
+        <w:t xml:space="preserve">, який перебирає отримані від API НБУ дані, перетворені у формат Python за допомогою </w:t>
+      </w:r>
+      <w:r>
+        <w:rPr>
+          <w:noProof w:val="0"/>
+          <w:lang w:val="en-US"/>
+        </w:rPr>
+        <w:t>response.json()</w:t>
+      </w:r>
+      <w:r>
+        <w:rPr>
+          <w:noProof w:val="0"/>
+          <w:lang w:val="en-US"/>
+        </w:rPr>
+        <w:t xml:space="preserve">. Умовний оператор </w:t>
+      </w:r>
+      <w:r>
+        <w:rPr>
+          <w:noProof w:val="0"/>
+          <w:lang w:val="en-US"/>
+        </w:rPr>
+        <w:t>if</w:t>
+      </w:r>
+      <w:r>
+        <w:rPr>
+          <w:noProof w:val="0"/>
+          <w:lang w:val="en-US"/>
+        </w:rPr>
+        <w:t xml:space="preserve"> порівнює код валюти </w:t>
+      </w:r>
+      <w:r>
+        <w:rPr>
+          <w:noProof w:val="0"/>
+          <w:lang w:val="en-US"/>
+        </w:rPr>
+        <w:t>elem["cc"]</w:t>
+      </w:r>
+      <w:r>
+        <w:rPr>
+          <w:noProof w:val="0"/>
+          <w:lang w:val="en-US"/>
+        </w:rPr>
+        <w:t xml:space="preserve"> із введеним користувачем значенням. Якщо валюти збігаються, програма отримує відповідний курс через </w:t>
+      </w:r>
+      <w:r>
+        <w:rPr>
+          <w:noProof w:val="0"/>
+          <w:lang w:val="en-US"/>
+        </w:rPr>
+        <w:t>elem["rate"]</w:t>
+      </w:r>
+      <w:r>
+        <w:rPr>
+          <w:noProof w:val="0"/>
+          <w:lang w:val="en-US"/>
+        </w:rPr>
+        <w:t>.</w:t>
+      </w:r>
+    </w:p>
+    <w:p>
+      <w:pPr>
+        <w:pStyle w:val="Normal"/>
+      </w:pPr>
+      <w:r>
+        <w:rPr>
+          <w:noProof w:val="0"/>
+          <w:lang w:val="en-US"/>
+        </w:rPr>
+        <w:t xml:space="preserve">Конвертація виконується шляхом множення введеної суми на курс валюти. Отриманий результат зберігається у змінній </w:t>
+      </w:r>
+      <w:r>
+        <w:rPr>
+          <w:noProof w:val="0"/>
+          <w:lang w:val="en-US"/>
+        </w:rPr>
+        <w:t>result</w:t>
+      </w:r>
+      <w:r>
+        <w:rPr>
+          <w:noProof w:val="0"/>
+          <w:lang w:val="en-US"/>
+        </w:rPr>
+        <w:t xml:space="preserve"> та виводиться на екран разом із курсом. Для округлення результату до двох знаків після коми використовується функція </w:t>
+      </w:r>
+      <w:r>
+        <w:rPr>
+          <w:noProof w:val="0"/>
+          <w:lang w:val="en-US"/>
+        </w:rPr>
+        <w:t>round(result, 2)</w:t>
+      </w:r>
+      <w:r>
+        <w:rPr>
+          <w:noProof w:val="0"/>
+          <w:lang w:val="en-US"/>
+        </w:rPr>
+        <w:t xml:space="preserve">. Після знаходження необхідної валюти цикл </w:t>
+      </w:r>
+      <w:r>
+        <w:rPr>
+          <w:noProof w:val="0"/>
+          <w:lang w:val="en-US"/>
+        </w:rPr>
+        <w:t>for</w:t>
+      </w:r>
+      <w:r>
+        <w:rPr>
+          <w:noProof w:val="0"/>
+          <w:lang w:val="en-US"/>
+        </w:rPr>
+        <w:t xml:space="preserve"> завершується за допомогою </w:t>
+      </w:r>
+      <w:r>
+        <w:rPr>
+          <w:noProof w:val="0"/>
+          <w:lang w:val="en-US"/>
+        </w:rPr>
+        <w:t>break</w:t>
+      </w:r>
+      <w:r>
+        <w:rPr>
+          <w:noProof w:val="0"/>
+          <w:lang w:val="en-US"/>
+        </w:rPr>
+        <w:t>.</w:t>
+      </w:r>
+    </w:p>
+    <w:p>
+      <w:pPr>
+        <w:pStyle w:val="Normal"/>
+      </w:pPr>
+      <w:r>
+        <w:rPr>
+          <w:noProof w:val="0"/>
+          <w:lang w:val="en-US"/>
+        </w:rPr>
+        <w:t xml:space="preserve">Таким </w:t>
+      </w:r>
+      <w:r>
+        <w:rPr>
+          <w:noProof w:val="0"/>
+          <w:lang w:val="en-US"/>
+        </w:rPr>
+        <w:t>чином</w:t>
+      </w:r>
+      <w:r>
+        <w:rPr>
+          <w:noProof w:val="0"/>
+          <w:lang w:val="en-US"/>
+        </w:rPr>
+        <w:t xml:space="preserve">, </w:t>
+      </w:r>
+      <w:r>
+        <w:rPr>
+          <w:noProof w:val="0"/>
+          <w:lang w:val="en-US"/>
+        </w:rPr>
+        <w:t>було</w:t>
+      </w:r>
+      <w:r>
+        <w:rPr>
+          <w:noProof w:val="0"/>
+          <w:lang w:val="en-US"/>
+        </w:rPr>
+        <w:t xml:space="preserve"> </w:t>
+      </w:r>
+      <w:r>
+        <w:rPr>
+          <w:noProof w:val="0"/>
+          <w:lang w:val="en-US"/>
+        </w:rPr>
+        <w:t>реалізовано</w:t>
+      </w:r>
+      <w:r>
+        <w:rPr>
+          <w:noProof w:val="0"/>
+          <w:lang w:val="en-US"/>
+        </w:rPr>
+        <w:t xml:space="preserve"> </w:t>
+      </w:r>
+      <w:r>
+        <w:rPr>
+          <w:noProof w:val="0"/>
+          <w:lang w:val="en-US"/>
+        </w:rPr>
+        <w:t>програму</w:t>
+      </w:r>
+      <w:r>
+        <w:rPr>
+          <w:noProof w:val="0"/>
+          <w:lang w:val="en-US"/>
+        </w:rPr>
+        <w:t xml:space="preserve"> </w:t>
+      </w:r>
+      <w:r>
+        <w:rPr>
+          <w:noProof w:val="0"/>
+          <w:lang w:val="en-US"/>
+        </w:rPr>
+        <w:t>конвертації</w:t>
+      </w:r>
+      <w:r>
+        <w:rPr>
+          <w:noProof w:val="0"/>
+          <w:lang w:val="en-US"/>
+        </w:rPr>
+        <w:t xml:space="preserve"> </w:t>
+      </w:r>
+      <w:r>
+        <w:rPr>
+          <w:noProof w:val="0"/>
+          <w:lang w:val="en-US"/>
+        </w:rPr>
+        <w:t>трьох</w:t>
+      </w:r>
+      <w:r>
+        <w:rPr>
+          <w:noProof w:val="0"/>
+          <w:lang w:val="en-US"/>
+        </w:rPr>
+        <w:t xml:space="preserve"> </w:t>
+      </w:r>
+      <w:r>
+        <w:rPr>
+          <w:noProof w:val="0"/>
+          <w:lang w:val="en-US"/>
+        </w:rPr>
+        <w:t>іноземних</w:t>
+      </w:r>
+      <w:r>
+        <w:rPr>
+          <w:noProof w:val="0"/>
+          <w:lang w:val="en-US"/>
+        </w:rPr>
+        <w:t xml:space="preserve"> </w:t>
+      </w:r>
+      <w:r>
+        <w:rPr>
+          <w:noProof w:val="0"/>
+          <w:lang w:val="en-US"/>
+        </w:rPr>
+        <w:t>валют</w:t>
+      </w:r>
+      <w:r>
+        <w:rPr>
+          <w:noProof w:val="0"/>
+          <w:lang w:val="en-US"/>
+        </w:rPr>
+        <w:t xml:space="preserve"> </w:t>
+      </w:r>
+      <w:r>
+        <w:rPr>
+          <w:noProof w:val="0"/>
+          <w:lang w:val="en-US"/>
+        </w:rPr>
+        <w:t xml:space="preserve">EUR, USD </w:t>
+      </w:r>
+      <w:r>
+        <w:rPr>
+          <w:noProof w:val="0"/>
+          <w:lang w:val="en-US"/>
+        </w:rPr>
+        <w:t>та</w:t>
+      </w:r>
+      <w:r>
+        <w:rPr>
+          <w:noProof w:val="0"/>
+          <w:lang w:val="en-US"/>
+        </w:rPr>
+        <w:t xml:space="preserve"> </w:t>
+      </w:r>
+      <w:r>
+        <w:rPr>
+          <w:noProof w:val="0"/>
+          <w:lang w:val="en-US"/>
+        </w:rPr>
+        <w:t xml:space="preserve">PLN в </w:t>
+      </w:r>
+      <w:r>
+        <w:rPr>
+          <w:noProof w:val="0"/>
+          <w:lang w:val="en-US"/>
+        </w:rPr>
+        <w:t>українську</w:t>
+      </w:r>
+      <w:r>
+        <w:rPr>
+          <w:noProof w:val="0"/>
+          <w:lang w:val="en-US"/>
+        </w:rPr>
+        <w:t xml:space="preserve"> </w:t>
+      </w:r>
+      <w:r>
+        <w:rPr>
+          <w:noProof w:val="0"/>
+          <w:lang w:val="en-US"/>
+        </w:rPr>
+        <w:t>гривню</w:t>
+      </w:r>
+      <w:r>
+        <w:rPr>
+          <w:noProof w:val="0"/>
+          <w:lang w:val="en-US"/>
+        </w:rPr>
+        <w:t xml:space="preserve"> з </w:t>
+      </w:r>
+      <w:r>
+        <w:rPr>
+          <w:noProof w:val="0"/>
+          <w:lang w:val="en-US"/>
+        </w:rPr>
+        <w:t>використанням</w:t>
+      </w:r>
+      <w:r>
+        <w:rPr>
+          <w:noProof w:val="0"/>
+          <w:lang w:val="en-US"/>
+        </w:rPr>
+        <w:t xml:space="preserve"> API </w:t>
+      </w:r>
+      <w:r>
+        <w:rPr>
+          <w:noProof w:val="0"/>
+          <w:lang w:val="en-US"/>
+        </w:rPr>
+        <w:t>Національного</w:t>
+      </w:r>
+      <w:r>
+        <w:rPr>
+          <w:noProof w:val="0"/>
+          <w:lang w:val="en-US"/>
+        </w:rPr>
+        <w:t xml:space="preserve"> </w:t>
+      </w:r>
+      <w:r>
+        <w:rPr>
+          <w:noProof w:val="0"/>
+          <w:lang w:val="en-US"/>
+        </w:rPr>
+        <w:t>банку</w:t>
+      </w:r>
+      <w:r>
+        <w:rPr>
+          <w:noProof w:val="0"/>
+          <w:lang w:val="en-US"/>
+        </w:rPr>
+        <w:t xml:space="preserve"> України. Програма </w:t>
+      </w:r>
+      <w:r>
+        <w:rPr>
+          <w:noProof w:val="0"/>
+          <w:lang w:val="en-US"/>
+        </w:rPr>
+        <w:t>дозволяє</w:t>
+      </w:r>
+      <w:r>
+        <w:rPr>
+          <w:noProof w:val="0"/>
+          <w:lang w:val="en-US"/>
+        </w:rPr>
+        <w:t xml:space="preserve"> </w:t>
+      </w:r>
+      <w:r>
+        <w:rPr>
+          <w:noProof w:val="0"/>
+          <w:lang w:val="en-US"/>
+        </w:rPr>
+        <w:t>користувачу</w:t>
+      </w:r>
+      <w:r>
+        <w:rPr>
+          <w:noProof w:val="0"/>
+          <w:lang w:val="en-US"/>
+        </w:rPr>
+        <w:t xml:space="preserve"> </w:t>
+      </w:r>
+      <w:r>
+        <w:rPr>
+          <w:noProof w:val="0"/>
+          <w:lang w:val="en-US"/>
+        </w:rPr>
+        <w:t>вибирати</w:t>
+      </w:r>
+      <w:r>
+        <w:rPr>
+          <w:noProof w:val="0"/>
+          <w:lang w:val="en-US"/>
+        </w:rPr>
+        <w:t xml:space="preserve"> </w:t>
+      </w:r>
+      <w:r>
+        <w:rPr>
+          <w:noProof w:val="0"/>
+          <w:lang w:val="en-US"/>
+        </w:rPr>
+        <w:t>валюту</w:t>
+      </w:r>
+      <w:r>
+        <w:rPr>
+          <w:noProof w:val="0"/>
+          <w:lang w:val="en-US"/>
+        </w:rPr>
+        <w:t xml:space="preserve">, </w:t>
+      </w:r>
+      <w:r>
+        <w:rPr>
+          <w:noProof w:val="0"/>
+          <w:lang w:val="en-US"/>
+        </w:rPr>
+        <w:t>вводити</w:t>
+      </w:r>
+      <w:r>
+        <w:rPr>
+          <w:noProof w:val="0"/>
+          <w:lang w:val="en-US"/>
+        </w:rPr>
+        <w:t xml:space="preserve"> </w:t>
+      </w:r>
+      <w:r>
+        <w:rPr>
+          <w:noProof w:val="0"/>
+          <w:lang w:val="en-US"/>
+        </w:rPr>
+        <w:t>суму</w:t>
+      </w:r>
+      <w:r>
+        <w:rPr>
+          <w:noProof w:val="0"/>
+          <w:lang w:val="en-US"/>
+        </w:rPr>
+        <w:t xml:space="preserve"> </w:t>
+      </w:r>
+      <w:r>
+        <w:rPr>
+          <w:noProof w:val="0"/>
+          <w:lang w:val="en-US"/>
+        </w:rPr>
+        <w:t>та</w:t>
+      </w:r>
+      <w:r>
+        <w:rPr>
+          <w:noProof w:val="0"/>
+          <w:lang w:val="en-US"/>
+        </w:rPr>
+        <w:t xml:space="preserve"> </w:t>
+      </w:r>
+      <w:r>
+        <w:rPr>
+          <w:noProof w:val="0"/>
+          <w:lang w:val="en-US"/>
+        </w:rPr>
+        <w:t>отримувати</w:t>
+      </w:r>
+      <w:r>
+        <w:rPr>
+          <w:noProof w:val="0"/>
+          <w:lang w:val="en-US"/>
+        </w:rPr>
+        <w:t xml:space="preserve"> </w:t>
+      </w:r>
+      <w:r>
+        <w:rPr>
+          <w:noProof w:val="0"/>
+          <w:lang w:val="en-US"/>
+        </w:rPr>
+        <w:t>результат</w:t>
+      </w:r>
+      <w:r>
+        <w:rPr>
+          <w:noProof w:val="0"/>
+          <w:lang w:val="en-US"/>
+        </w:rPr>
+        <w:t xml:space="preserve"> </w:t>
+      </w:r>
+      <w:r>
+        <w:rPr>
+          <w:noProof w:val="0"/>
+          <w:lang w:val="en-US"/>
+        </w:rPr>
+        <w:t>конвертації</w:t>
+      </w:r>
+      <w:r>
+        <w:rPr>
+          <w:noProof w:val="0"/>
+          <w:lang w:val="en-US"/>
+        </w:rPr>
+        <w:t xml:space="preserve"> </w:t>
+      </w:r>
+      <w:r>
+        <w:rPr>
+          <w:noProof w:val="0"/>
+          <w:lang w:val="en-US"/>
+        </w:rPr>
+        <w:t>відповідно</w:t>
+      </w:r>
+      <w:r>
+        <w:rPr>
+          <w:noProof w:val="0"/>
+          <w:lang w:val="en-US"/>
+        </w:rPr>
+        <w:t xml:space="preserve"> </w:t>
+      </w:r>
+      <w:r>
+        <w:rPr>
+          <w:noProof w:val="0"/>
+          <w:lang w:val="en-US"/>
+        </w:rPr>
+        <w:t>до</w:t>
+      </w:r>
+      <w:r>
+        <w:rPr>
+          <w:noProof w:val="0"/>
+          <w:lang w:val="en-US"/>
+        </w:rPr>
+        <w:t xml:space="preserve"> </w:t>
+      </w:r>
+      <w:r>
+        <w:rPr>
+          <w:noProof w:val="0"/>
+          <w:lang w:val="en-US"/>
+        </w:rPr>
+        <w:t>офіційного</w:t>
+      </w:r>
+      <w:r>
+        <w:rPr>
+          <w:noProof w:val="0"/>
+          <w:lang w:val="en-US"/>
+        </w:rPr>
+        <w:t xml:space="preserve"> </w:t>
+      </w:r>
+      <w:r>
+        <w:rPr>
+          <w:noProof w:val="0"/>
+          <w:lang w:val="en-US"/>
+        </w:rPr>
+        <w:t>курсу</w:t>
+      </w:r>
+      <w:r>
+        <w:rPr>
+          <w:noProof w:val="0"/>
+          <w:lang w:val="en-US"/>
+        </w:rPr>
+        <w:t xml:space="preserve">, </w:t>
+      </w:r>
+      <w:r>
+        <w:rPr>
+          <w:noProof w:val="0"/>
+          <w:lang w:val="en-US"/>
+        </w:rPr>
+        <w:t>завантаженого</w:t>
+      </w:r>
+      <w:r>
+        <w:rPr>
+          <w:noProof w:val="0"/>
+          <w:lang w:val="en-US"/>
+        </w:rPr>
+        <w:t xml:space="preserve"> </w:t>
+      </w:r>
+      <w:r>
+        <w:rPr>
+          <w:noProof w:val="0"/>
+          <w:lang w:val="en-US"/>
+        </w:rPr>
+        <w:t>під</w:t>
+      </w:r>
+      <w:r>
+        <w:rPr>
+          <w:noProof w:val="0"/>
+          <w:lang w:val="en-US"/>
+        </w:rPr>
+        <w:t xml:space="preserve"> </w:t>
+      </w:r>
+      <w:r>
+        <w:rPr>
+          <w:noProof w:val="0"/>
+          <w:lang w:val="en-US"/>
+        </w:rPr>
+        <w:t>час</w:t>
+      </w:r>
+      <w:r>
+        <w:rPr>
+          <w:noProof w:val="0"/>
+          <w:lang w:val="en-US"/>
+        </w:rPr>
+        <w:t xml:space="preserve"> </w:t>
+      </w:r>
+      <w:r>
+        <w:rPr>
+          <w:noProof w:val="0"/>
+          <w:lang w:val="en-US"/>
+        </w:rPr>
+        <w:t>запуску</w:t>
+      </w:r>
+      <w:r>
+        <w:rPr>
+          <w:noProof w:val="0"/>
+          <w:lang w:val="en-US"/>
+        </w:rPr>
+        <w:t xml:space="preserve"> </w:t>
+      </w:r>
+      <w:r>
+        <w:rPr>
+          <w:noProof w:val="0"/>
+          <w:lang w:val="en-US"/>
+        </w:rPr>
+        <w:t>програми</w:t>
+      </w:r>
+      <w:r>
+        <w:rPr>
+          <w:noProof w:val="0"/>
+          <w:lang w:val="en-US"/>
+        </w:rPr>
+        <w:t>.</w:t>
+      </w:r>
+    </w:p>
+    <w:p>
+      <w:pPr>
+        <w:pStyle w:val="Normal"/>
+      </w:pPr>
+      <w:r>
+        <w:rPr>
+          <w:lang w:val="uk-UA"/>
+        </w:rPr>
+        <w:t>Текст програми:</w:t>
+      </w:r>
+    </w:p>
+    <w:p>
+      <w:pPr>
+        <w:pStyle w:val="Normal"/>
+        <w:ind w:firstLine="0"/>
+      </w:pPr>
+      <w:r>
+        <w:drawing>
+          <wp:inline wp14:editId="7AE98428" wp14:anchorId="7519131B">
+            <wp:extent cx="5943600" cy="3476625"/>
+            <wp:effectExtent l="0" t="0" r="0" b="0"/>
+            <wp:docPr id="229832763" name="drawing"/>
+            <wp:cNvGraphicFramePr>
+              <a:graphicFrameLocks noChangeAspect="1"/>
+            </wp:cNvGraphicFramePr>
+            <a:graphic>
+              <a:graphicData xmlns:a="http://schemas.openxmlformats.org/drawingml/2006/main" uri="http://schemas.openxmlformats.org/drawingml/2006/picture">
+                <pic:pic xmlns:pic="http://schemas.openxmlformats.org/drawingml/2006/picture">
+                  <pic:nvPicPr>
+                    <pic:cNvPr id="229832763" name="Picture 229832763"/>
+                    <pic:cNvPicPr/>
+                  </pic:nvPicPr>
+                  <pic:blipFill>
+                    <a:blip xmlns:r="http://schemas.openxmlformats.org/officeDocument/2006/relationships" r:embed="rId2128440351">
+                      <a:extLst>
+                        <a:ext uri="{28A0092B-C50C-407E-A947-70E740481C1C}">
+                          <a14:useLocalDpi xmlns:a14="http://schemas.microsoft.com/office/drawing/2010/main"/>
+                        </a:ext>
+                      </a:extLst>
+                    </a:blip>
+                    <a:stretch>
+                      <a:fillRect/>
+                    </a:stretch>
+                  </pic:blipFill>
+                  <pic:spPr>
+                    <a:xfrm>
+                      <a:off x="0" y="0"/>
+                      <a:ext cx="5943600" cy="3476625"/>
+                    </a:xfrm>
+                    <a:prstGeom prst="rect">
+                      <a:avLst/>
+                    </a:prstGeom>
+                  </pic:spPr>
+                </pic:pic>
+              </a:graphicData>
+            </a:graphic>
+          </wp:inline>
+        </w:drawing>
+      </w:r>
+      <w:r>
+        <w:tab/>
+      </w:r>
+      <w:r>
+        <w:rPr>
+          <w:lang w:val="uk-UA"/>
+        </w:rPr>
+        <w:t xml:space="preserve">Посилання на </w:t>
+      </w:r>
+      <w:r>
+        <w:rPr/>
+        <w:t>github</w:t>
+      </w:r>
+      <w:r>
+        <w:rPr>
+          <w:lang w:val="ru-RU"/>
+        </w:rPr>
+        <w:t>:</w:t>
+      </w:r>
+      <w:r>
+        <w:rPr>
+          <w:lang w:val="ru-RU"/>
+        </w:rPr>
+        <w:t xml:space="preserve"> https://github.com/igor231083-cmd/TP-KB-251-Igor-Kharcenko/blob/main/Topic_05/test02.py</w:t>
+      </w:r>
+      <w:r>
+        <w:rPr>
+          <w:lang w:val="ru-RU"/>
+        </w:rPr>
+        <w:t xml:space="preserve"> </w:t>
+      </w:r>
+    </w:p>
+    <w:p>
+      <w:pPr>
+        <w:pStyle w:val="Normal"/>
+      </w:pPr>
+      <w:r>
+        <w:rPr>
+          <w:lang w:val="uk-UA"/>
+        </w:rPr>
+        <w:t xml:space="preserve">Знімок екрану з посилання на </w:t>
+      </w:r>
+      <w:r>
+        <w:rPr/>
+        <w:t>github</w:t>
+      </w:r>
+      <w:r>
+        <w:rPr/>
+        <w:t>:</w:t>
+      </w:r>
+    </w:p>
+    <w:p>
+      <w:pPr>
+        <w:pStyle w:val="Normal"/>
+        <w:ind w:firstLine="0"/>
+      </w:pPr>
+      <w:r>
+        <w:drawing>
+          <wp:inline wp14:editId="1DBD4A10" wp14:anchorId="0F83B717">
+            <wp:extent cx="5943600" cy="5305425"/>
+            <wp:effectExtent l="0" t="0" r="0" b="0"/>
+            <wp:docPr id="1745594946" name="drawing"/>
+            <wp:cNvGraphicFramePr>
+              <a:graphicFrameLocks noChangeAspect="1"/>
+            </wp:cNvGraphicFramePr>
+            <a:graphic>
+              <a:graphicData xmlns:a="http://schemas.openxmlformats.org/drawingml/2006/main" uri="http://schemas.openxmlformats.org/drawingml/2006/picture">
+                <pic:pic xmlns:pic="http://schemas.openxmlformats.org/drawingml/2006/picture">
+                  <pic:nvPicPr>
+                    <pic:cNvPr id="1745594946" name="Picture 1745594946"/>
+                    <pic:cNvPicPr/>
+                  </pic:nvPicPr>
+                  <pic:blipFill>
+                    <a:blip xmlns:r="http://schemas.openxmlformats.org/officeDocument/2006/relationships" r:embed="rId25335629">
+                      <a:extLst>
+                        <a:ext uri="{28A0092B-C50C-407E-A947-70E740481C1C}">
+                          <a14:useLocalDpi xmlns:a14="http://schemas.microsoft.com/office/drawing/2010/main"/>
+                        </a:ext>
+                      </a:extLst>
+                    </a:blip>
+                    <a:stretch>
+                      <a:fillRect/>
+                    </a:stretch>
+                  </pic:blipFill>
+                  <pic:spPr>
+                    <a:xfrm>
+                      <a:off x="0" y="0"/>
+                      <a:ext cx="5943600" cy="5305425"/>
+                    </a:xfrm>
+                    <a:prstGeom prst="rect">
+                      <a:avLst/>
+                    </a:prstGeom>
+                  </pic:spPr>
+                </pic:pic>
+              </a:graphicData>
+            </a:graphic>
+          </wp:inline>
+        </w:drawing>
+      </w:r>
+    </w:p>
+    <w:p>
+      <w:pPr>
+        <w:spacing w:line="360" w:lineRule="auto"/>
+        <w:jc w:val="both"/>
+      </w:pPr>
+      <w:r>
+        <w:rPr>
+          <w:rFonts w:ascii="Times New Roman" w:hAnsi="Times New Roman" w:eastAsia="Times New Roman" w:cs="Times New Roman"/>
+          <w:b w:val="1"/>
+          <w:bCs w:val="1"/>
+          <w:i w:val="0"/>
+          <w:iCs w:val="0"/>
+          <w:caps w:val="0"/>
+          <w:smallCaps w:val="0"/>
+          <w:noProof w:val="0"/>
+          <w:color w:val="000000" w:themeColor="text1" w:themeTint="FF" w:themeShade="FF"/>
+          <w:sz w:val="28"/>
+          <w:szCs w:val="28"/>
+          <w:lang w:val="uk-UA"/>
+        </w:rPr>
+        <w:t>Використання модулів для програми калькулятор. Функції додавання, віднімання, множення та ділення перенести в файл functions.py. Функції запиту на введення даних для операцій та самих операцій перемістити в файл operations.py. Програму калькулятор реалізувати в файлі calc.py, до якого підключають файл functions.py та operations.py.</w:t>
+      </w:r>
+    </w:p>
+    <w:p>
+      <w:pPr>
+        <w:pStyle w:val="Normal"/>
+        <w:rPr>
+          <w:noProof w:val="0"/>
+          <w:lang w:val="uk-UA"/>
+        </w:rPr>
+      </w:pPr>
+    </w:p>
+    <w:p>
+      <w:pPr>
+        <w:pStyle w:val="Normal"/>
+      </w:pPr>
+      <w:r>
+        <w:rPr>
+          <w:noProof w:val="0"/>
+          <w:lang w:val="uk-UA"/>
+        </w:rPr>
+        <w:t>Хід виконання завдання</w:t>
+      </w:r>
+    </w:p>
+    <w:p>
+      <w:pPr>
+        <w:pStyle w:val="Normal"/>
+      </w:pPr>
+      <w:r>
+        <w:rPr>
+          <w:noProof w:val="0"/>
+          <w:lang w:val="uk-UA"/>
+        </w:rPr>
+        <w:t xml:space="preserve">Під час виконання завдання було модифіковано раніше створену програму калькулятора шляхом розподілення її функцій між окремими файлами </w:t>
+      </w:r>
+      <w:r>
+        <w:rPr>
+          <w:noProof w:val="0"/>
+          <w:lang w:val="uk-UA"/>
+        </w:rPr>
+        <w:t>functions.py</w:t>
+      </w:r>
+      <w:r>
+        <w:rPr>
+          <w:noProof w:val="0"/>
+          <w:lang w:val="uk-UA"/>
+        </w:rPr>
+        <w:t xml:space="preserve">, </w:t>
+      </w:r>
+      <w:r>
+        <w:rPr>
+          <w:noProof w:val="0"/>
+          <w:lang w:val="uk-UA"/>
+        </w:rPr>
+        <w:t>operations.py</w:t>
+      </w:r>
+      <w:r>
+        <w:rPr>
+          <w:noProof w:val="0"/>
+          <w:lang w:val="uk-UA"/>
+        </w:rPr>
+        <w:t xml:space="preserve"> та </w:t>
+      </w:r>
+      <w:r>
+        <w:rPr>
+          <w:noProof w:val="0"/>
+          <w:lang w:val="uk-UA"/>
+        </w:rPr>
+        <w:t>calc.py</w:t>
+      </w:r>
+      <w:r>
+        <w:rPr>
+          <w:noProof w:val="0"/>
+          <w:lang w:val="uk-UA"/>
+        </w:rPr>
+        <w:t>. Це дозволило організувати програму за модульним принципом, розділивши математичні обчислення, введення даних та керування роботою калькулятора.</w:t>
+      </w:r>
+    </w:p>
+    <w:p>
+      <w:pPr>
+        <w:pStyle w:val="Normal"/>
+      </w:pPr>
+      <w:r>
+        <w:rPr>
+          <w:noProof w:val="0"/>
+          <w:lang w:val="uk-UA"/>
+        </w:rPr>
+        <w:t xml:space="preserve">Спочатку було створено файл </w:t>
+      </w:r>
+      <w:r>
+        <w:rPr>
+          <w:noProof w:val="0"/>
+          <w:lang w:val="uk-UA"/>
+        </w:rPr>
+        <w:t>functions.py</w:t>
+      </w:r>
+      <w:r>
+        <w:rPr>
+          <w:noProof w:val="0"/>
+          <w:lang w:val="uk-UA"/>
+        </w:rPr>
+        <w:t xml:space="preserve">, до якого перенесено раніше розроблені функції </w:t>
+      </w:r>
+      <w:r>
+        <w:rPr>
+          <w:noProof w:val="0"/>
+          <w:lang w:val="uk-UA"/>
+        </w:rPr>
+        <w:t>sum()</w:t>
+      </w:r>
+      <w:r>
+        <w:rPr>
+          <w:noProof w:val="0"/>
+          <w:lang w:val="uk-UA"/>
+        </w:rPr>
+        <w:t xml:space="preserve">, </w:t>
+      </w:r>
+      <w:r>
+        <w:rPr>
+          <w:noProof w:val="0"/>
+          <w:lang w:val="uk-UA"/>
+        </w:rPr>
+        <w:t>rem()</w:t>
+      </w:r>
+      <w:r>
+        <w:rPr>
+          <w:noProof w:val="0"/>
+          <w:lang w:val="uk-UA"/>
+        </w:rPr>
+        <w:t xml:space="preserve">, </w:t>
+      </w:r>
+      <w:r>
+        <w:rPr>
+          <w:noProof w:val="0"/>
+          <w:lang w:val="uk-UA"/>
+        </w:rPr>
+        <w:t>mul()</w:t>
+      </w:r>
+      <w:r>
+        <w:rPr>
+          <w:noProof w:val="0"/>
+          <w:lang w:val="uk-UA"/>
+        </w:rPr>
+        <w:t xml:space="preserve"> та </w:t>
+      </w:r>
+      <w:r>
+        <w:rPr>
+          <w:noProof w:val="0"/>
+          <w:lang w:val="uk-UA"/>
+        </w:rPr>
+        <w:t>div()</w:t>
+      </w:r>
+      <w:r>
+        <w:rPr>
+          <w:noProof w:val="0"/>
+          <w:lang w:val="uk-UA"/>
+        </w:rPr>
+        <w:t xml:space="preserve">. Ці функції відповідають за виконання основних математичних операцій: додавання, віднімання, множення та ділення. У функції </w:t>
+      </w:r>
+      <w:r>
+        <w:rPr>
+          <w:noProof w:val="0"/>
+          <w:lang w:val="uk-UA"/>
+        </w:rPr>
+        <w:t>div()</w:t>
+      </w:r>
+      <w:r>
+        <w:rPr>
+          <w:noProof w:val="0"/>
+          <w:lang w:val="uk-UA"/>
+        </w:rPr>
+        <w:t xml:space="preserve"> було збережено обробку виняткової ситуації </w:t>
+      </w:r>
+      <w:r>
+        <w:rPr>
+          <w:noProof w:val="0"/>
+          <w:lang w:val="uk-UA"/>
+        </w:rPr>
+        <w:t>ZeroDivisionError</w:t>
+      </w:r>
+      <w:r>
+        <w:rPr>
+          <w:noProof w:val="0"/>
+          <w:lang w:val="uk-UA"/>
+        </w:rPr>
+        <w:t>, яка запобігає аварійному завершенню програми під час ділення на нуль.</w:t>
+      </w:r>
+    </w:p>
+    <w:p>
+      <w:pPr>
+        <w:pStyle w:val="Normal"/>
+      </w:pPr>
+      <w:r>
+        <w:rPr>
+          <w:noProof w:val="0"/>
+          <w:lang w:val="uk-UA"/>
+        </w:rPr>
+        <w:t xml:space="preserve">Далі було створено файл </w:t>
+      </w:r>
+      <w:r>
+        <w:rPr>
+          <w:noProof w:val="0"/>
+          <w:lang w:val="uk-UA"/>
+        </w:rPr>
+        <w:t>operations.py</w:t>
+      </w:r>
+      <w:r>
+        <w:rPr>
+          <w:noProof w:val="0"/>
+          <w:lang w:val="uk-UA"/>
+        </w:rPr>
+        <w:t xml:space="preserve">, у якому реалізовано функції для введення даних та виконання математичних операцій. Функція </w:t>
+      </w:r>
+      <w:r>
+        <w:rPr>
+          <w:noProof w:val="0"/>
+          <w:lang w:val="uk-UA"/>
+        </w:rPr>
+        <w:t>getSymbol()</w:t>
+      </w:r>
+      <w:r>
+        <w:rPr>
+          <w:noProof w:val="0"/>
+          <w:lang w:val="uk-UA"/>
+        </w:rPr>
+        <w:t xml:space="preserve"> запитує у користувача символ операції, а функція </w:t>
+      </w:r>
+      <w:r>
+        <w:rPr>
+          <w:noProof w:val="0"/>
+          <w:lang w:val="uk-UA"/>
+        </w:rPr>
+        <w:t>getNumber()</w:t>
+      </w:r>
+      <w:r>
+        <w:rPr>
+          <w:noProof w:val="0"/>
+          <w:lang w:val="uk-UA"/>
+        </w:rPr>
+        <w:t xml:space="preserve"> дозволяє ввести число та перетворює його на цілочисельний тип за допомогою </w:t>
+      </w:r>
+      <w:r>
+        <w:rPr>
+          <w:noProof w:val="0"/>
+          <w:lang w:val="uk-UA"/>
+        </w:rPr>
+        <w:t>int()</w:t>
+      </w:r>
+      <w:r>
+        <w:rPr>
+          <w:noProof w:val="0"/>
+          <w:lang w:val="uk-UA"/>
+        </w:rPr>
+        <w:t>.</w:t>
+      </w:r>
+    </w:p>
+    <w:p>
+      <w:pPr>
+        <w:pStyle w:val="Normal"/>
+      </w:pPr>
+      <w:r>
+        <w:rPr>
+          <w:noProof w:val="0"/>
+          <w:lang w:val="uk-UA"/>
+        </w:rPr>
+        <w:t xml:space="preserve">У цьому ж файлі було реалізовано функцію </w:t>
+      </w:r>
+      <w:r>
+        <w:rPr>
+          <w:noProof w:val="0"/>
+          <w:lang w:val="uk-UA"/>
+        </w:rPr>
+        <w:t>doOperation()</w:t>
+      </w:r>
+      <w:r>
+        <w:rPr>
+          <w:noProof w:val="0"/>
+          <w:lang w:val="uk-UA"/>
+        </w:rPr>
+        <w:t xml:space="preserve">, яка перевіряє правильність введеного символу та за допомогою конструкції </w:t>
+      </w:r>
+      <w:r>
+        <w:rPr>
+          <w:noProof w:val="0"/>
+          <w:lang w:val="uk-UA"/>
+        </w:rPr>
+        <w:t>match case</w:t>
+      </w:r>
+      <w:r>
+        <w:rPr>
+          <w:noProof w:val="0"/>
+          <w:lang w:val="uk-UA"/>
+        </w:rPr>
+        <w:t xml:space="preserve"> визначає необхідну математичну операцію. Для виконання обчислень використовується модуль </w:t>
+      </w:r>
+      <w:r>
+        <w:rPr>
+          <w:noProof w:val="0"/>
+          <w:lang w:val="uk-UA"/>
+        </w:rPr>
+        <w:t>functions</w:t>
+      </w:r>
+      <w:r>
+        <w:rPr>
+          <w:noProof w:val="0"/>
+          <w:lang w:val="uk-UA"/>
+        </w:rPr>
+        <w:t xml:space="preserve">, підключений командою </w:t>
+      </w:r>
+      <w:r>
+        <w:rPr>
+          <w:noProof w:val="0"/>
+          <w:lang w:val="uk-UA"/>
+        </w:rPr>
+        <w:t>import functions</w:t>
+      </w:r>
+      <w:r>
+        <w:rPr>
+          <w:noProof w:val="0"/>
+          <w:lang w:val="uk-UA"/>
+        </w:rPr>
+        <w:t xml:space="preserve">. Також було збережено обробку винятку </w:t>
+      </w:r>
+      <w:r>
+        <w:rPr>
+          <w:noProof w:val="0"/>
+          <w:lang w:val="uk-UA"/>
+        </w:rPr>
+        <w:t>ValueError</w:t>
+      </w:r>
+      <w:r>
+        <w:rPr>
+          <w:noProof w:val="0"/>
+          <w:lang w:val="uk-UA"/>
+        </w:rPr>
+        <w:t>, який виникає у випадку введення некоректних числових даних.</w:t>
+      </w:r>
+    </w:p>
+    <w:p>
+      <w:pPr>
+        <w:pStyle w:val="Normal"/>
+      </w:pPr>
+      <w:r>
+        <w:rPr>
+          <w:noProof w:val="0"/>
+          <w:lang w:val="uk-UA"/>
+        </w:rPr>
+        <w:t xml:space="preserve">Після цього було створено головний файл </w:t>
+      </w:r>
+      <w:r>
+        <w:rPr>
+          <w:noProof w:val="0"/>
+          <w:lang w:val="uk-UA"/>
+        </w:rPr>
+        <w:t>calc.py</w:t>
+      </w:r>
+      <w:r>
+        <w:rPr>
+          <w:noProof w:val="0"/>
+          <w:lang w:val="uk-UA"/>
+        </w:rPr>
+        <w:t xml:space="preserve">, до якого за допомогою команд </w:t>
+      </w:r>
+      <w:r>
+        <w:rPr>
+          <w:noProof w:val="0"/>
+          <w:lang w:val="uk-UA"/>
+        </w:rPr>
+        <w:t>import functions</w:t>
+      </w:r>
+      <w:r>
+        <w:rPr>
+          <w:noProof w:val="0"/>
+          <w:lang w:val="uk-UA"/>
+        </w:rPr>
+        <w:t xml:space="preserve"> та </w:t>
+      </w:r>
+      <w:r>
+        <w:rPr>
+          <w:noProof w:val="0"/>
+          <w:lang w:val="uk-UA"/>
+        </w:rPr>
+        <w:t>import operations</w:t>
+      </w:r>
+      <w:r>
+        <w:rPr>
+          <w:noProof w:val="0"/>
+          <w:lang w:val="uk-UA"/>
+        </w:rPr>
+        <w:t xml:space="preserve"> підключено необхідні модулі. У цьому файлі реалізовано основний цикл </w:t>
+      </w:r>
+      <w:r>
+        <w:rPr>
+          <w:noProof w:val="0"/>
+          <w:lang w:val="uk-UA"/>
+        </w:rPr>
+        <w:t>while True</w:t>
+      </w:r>
+      <w:r>
+        <w:rPr>
+          <w:noProof w:val="0"/>
+          <w:lang w:val="uk-UA"/>
+        </w:rPr>
+        <w:t xml:space="preserve">, який забезпечує багаторазове виконання обчислень. Для отримання математичного символу використовується функція </w:t>
+      </w:r>
+      <w:r>
+        <w:rPr>
+          <w:noProof w:val="0"/>
+          <w:lang w:val="uk-UA"/>
+        </w:rPr>
+        <w:t>operations.getSymbol()</w:t>
+      </w:r>
+      <w:r>
+        <w:rPr>
+          <w:noProof w:val="0"/>
+          <w:lang w:val="uk-UA"/>
+        </w:rPr>
+        <w:t xml:space="preserve">, а для виконання обраної операції викликається </w:t>
+      </w:r>
+      <w:r>
+        <w:rPr>
+          <w:noProof w:val="0"/>
+          <w:lang w:val="uk-UA"/>
+        </w:rPr>
+        <w:t>operations.doOperation(symbol)</w:t>
+      </w:r>
+      <w:r>
+        <w:rPr>
+          <w:noProof w:val="0"/>
+          <w:lang w:val="uk-UA"/>
+        </w:rPr>
+        <w:t>.</w:t>
+      </w:r>
+    </w:p>
+    <w:p>
+      <w:pPr>
+        <w:pStyle w:val="Normal"/>
+      </w:pPr>
+      <w:r>
+        <w:rPr>
+          <w:noProof w:val="0"/>
+          <w:lang w:val="uk-UA"/>
+        </w:rPr>
+        <w:t xml:space="preserve">Також було передбачено можливість завершення роботи програми. Якщо користувач вводить символ </w:t>
+      </w:r>
+      <w:r>
+        <w:rPr>
+          <w:noProof w:val="0"/>
+          <w:lang w:val="uk-UA"/>
+        </w:rPr>
+        <w:t>q</w:t>
+      </w:r>
+      <w:r>
+        <w:rPr>
+          <w:noProof w:val="0"/>
+          <w:lang w:val="uk-UA"/>
+        </w:rPr>
+        <w:t xml:space="preserve">, на екран виводиться повідомлення </w:t>
+      </w:r>
+      <w:r>
+        <w:rPr>
+          <w:noProof w:val="0"/>
+          <w:lang w:val="uk-UA"/>
+        </w:rPr>
+        <w:t>Exit</w:t>
+      </w:r>
+      <w:r>
+        <w:rPr>
+          <w:noProof w:val="0"/>
+          <w:lang w:val="uk-UA"/>
+        </w:rPr>
+        <w:t xml:space="preserve">, після чого цикл завершується за допомогою </w:t>
+      </w:r>
+      <w:r>
+        <w:rPr>
+          <w:noProof w:val="0"/>
+          <w:lang w:val="uk-UA"/>
+        </w:rPr>
+        <w:t>break</w:t>
+      </w:r>
+      <w:r>
+        <w:rPr>
+          <w:noProof w:val="0"/>
+          <w:lang w:val="uk-UA"/>
+        </w:rPr>
+        <w:t>.</w:t>
+      </w:r>
+    </w:p>
+    <w:p>
+      <w:pPr>
+        <w:pStyle w:val="Normal"/>
+      </w:pPr>
+      <w:r>
+        <w:rPr>
+          <w:noProof w:val="0"/>
+          <w:lang w:val="uk-UA"/>
+        </w:rPr>
+        <w:t>Таким чином, було вдосконалено раніше розроблену програму калькулятора шляхом використання модулів Python. Розподілення функціональності між трьома файлами дозволило зробити структуру програми більш зрозумілою, спростити її подальше редагування та забезпечити повторне використання створених функцій.</w:t>
+      </w:r>
+    </w:p>
+    <w:p>
+      <w:pPr>
+        <w:spacing w:line="360" w:lineRule="auto"/>
+        <w:jc w:val="both"/>
+        <w:rPr>
+          <w:rFonts w:ascii="Times New Roman" w:hAnsi="Times New Roman" w:eastAsia="Times New Roman" w:cs="Times New Roman"/>
+          <w:b w:val="1"/>
+          <w:bCs w:val="1"/>
+          <w:i w:val="0"/>
+          <w:iCs w:val="0"/>
+          <w:caps w:val="0"/>
+          <w:smallCaps w:val="0"/>
+          <w:noProof w:val="0"/>
+          <w:color w:val="000000" w:themeColor="text1" w:themeTint="FF" w:themeShade="FF"/>
+          <w:sz w:val="28"/>
+          <w:szCs w:val="28"/>
+          <w:lang w:val="uk-UA"/>
+        </w:rPr>
+      </w:pPr>
+    </w:p>
+    <w:p>
+      <w:pPr>
+        <w:pStyle w:val="Normal"/>
+        <w:ind w:firstLine="0"/>
+      </w:pPr>
+    </w:p>
+    <w:p>
+      <w:pPr>
+        <w:pStyle w:val="Normal"/>
+      </w:pPr>
+      <w:r>
+        <w:rPr>
+          <w:lang w:val="uk-UA"/>
+        </w:rPr>
+        <w:t>Текст програми:</w:t>
+      </w:r>
+    </w:p>
+    <w:p>
+      <w:pPr>
+        <w:pStyle w:val="Normal"/>
+        <w:ind w:firstLine="0"/>
+      </w:pPr>
+      <w:r>
+        <w:drawing>
+          <wp:inline wp14:editId="3E83A27F" wp14:anchorId="7B47DA64">
+            <wp:extent cx="5838825" cy="5943600"/>
+            <wp:effectExtent l="0" t="0" r="0" b="0"/>
+            <wp:docPr id="868356846" name="drawing"/>
+            <wp:cNvGraphicFramePr>
+              <a:graphicFrameLocks noChangeAspect="1"/>
+            </wp:cNvGraphicFramePr>
+            <a:graphic>
+              <a:graphicData xmlns:a="http://schemas.openxmlformats.org/drawingml/2006/main" uri="http://schemas.openxmlformats.org/drawingml/2006/picture">
+                <pic:pic xmlns:pic="http://schemas.openxmlformats.org/drawingml/2006/picture">
+                  <pic:nvPicPr>
+                    <pic:cNvPr id="868356846" name="Picture 868356846"/>
+                    <pic:cNvPicPr/>
+                  </pic:nvPicPr>
+                  <pic:blipFill>
+                    <a:blip xmlns:r="http://schemas.openxmlformats.org/officeDocument/2006/relationships" r:embed="rId15369094">
+                      <a:extLst>
+                        <a:ext uri="{28A0092B-C50C-407E-A947-70E740481C1C}">
+                          <a14:useLocalDpi xmlns:a14="http://schemas.microsoft.com/office/drawing/2010/main"/>
+                        </a:ext>
+                      </a:extLst>
+                    </a:blip>
+                    <a:stretch>
+                      <a:fillRect/>
+                    </a:stretch>
+                  </pic:blipFill>
+                  <pic:spPr>
+                    <a:xfrm>
+                      <a:off x="0" y="0"/>
+                      <a:ext cx="5838825" cy="5943600"/>
+                    </a:xfrm>
+                    <a:prstGeom prst="rect">
+                      <a:avLst/>
+                    </a:prstGeom>
+                  </pic:spPr>
+                </pic:pic>
+              </a:graphicData>
+            </a:graphic>
+          </wp:inline>
+        </w:drawing>
+      </w:r>
+    </w:p>
+    <w:p>
+      <w:pPr>
+        <w:pStyle w:val="Normal"/>
+        <w:spacing w:before="240" w:beforeAutospacing="off" w:after="240" w:afterAutospacing="off" w:line="360" w:lineRule="auto"/>
+      </w:pPr>
+      <w:r>
+        <w:rPr>
+          <w:lang w:val="uk-UA"/>
+        </w:rPr>
+        <w:t xml:space="preserve">Посилання на </w:t>
+      </w:r>
+      <w:r>
+        <w:rPr/>
+        <w:t>github</w:t>
+      </w:r>
+      <w:r>
+        <w:rPr>
+          <w:lang w:val="ru-RU"/>
+        </w:rPr>
+        <w:t>:</w:t>
+      </w:r>
+      <w:r>
+        <w:rPr>
+          <w:lang w:val="ru-RU"/>
+        </w:rPr>
+        <w:t xml:space="preserve"> </w:t>
+      </w:r>
+      <w:r>
+        <w:rPr>
+          <w:lang w:val="ru-RU"/>
+        </w:rPr>
+        <w:t>https://github.com/igor231083-cmd/TP-KB-251-Igor-Kharcenko/blob/main/Topic_05/operations.py</w:t>
+      </w:r>
+    </w:p>
+    <w:p>
+      <w:pPr>
+        <w:pStyle w:val="Normal"/>
+      </w:pPr>
+      <w:r>
+        <w:rPr>
+          <w:lang w:val="uk-UA"/>
+        </w:rPr>
+        <w:t xml:space="preserve">Знімок екрану з посилання на </w:t>
+      </w:r>
+      <w:r>
+        <w:rPr/>
+        <w:t>github</w:t>
+      </w:r>
+      <w:r>
+        <w:rPr/>
+        <w:t>:</w:t>
+      </w:r>
+    </w:p>
+    <w:p>
+      <w:pPr>
+        <w:pStyle w:val="Normal"/>
+      </w:pPr>
+      <w:r>
+        <w:drawing>
+          <wp:inline wp14:editId="51416BE5" wp14:anchorId="4E40DC75">
+            <wp:extent cx="4076700" cy="5943600"/>
+            <wp:effectExtent l="0" t="0" r="0" b="0"/>
+            <wp:docPr id="941175204" name="drawing"/>
+            <wp:cNvGraphicFramePr>
+              <a:graphicFrameLocks noChangeAspect="1"/>
+            </wp:cNvGraphicFramePr>
+            <a:graphic>
+              <a:graphicData xmlns:a="http://schemas.openxmlformats.org/drawingml/2006/main" uri="http://schemas.openxmlformats.org/drawingml/2006/picture">
+                <pic:pic xmlns:pic="http://schemas.openxmlformats.org/drawingml/2006/picture">
+                  <pic:nvPicPr>
+                    <pic:cNvPr id="941175204" name="Picture 941175204"/>
+                    <pic:cNvPicPr/>
+                  </pic:nvPicPr>
+                  <pic:blipFill>
+                    <a:blip xmlns:r="http://schemas.openxmlformats.org/officeDocument/2006/relationships" r:embed="rId1180378487">
+                      <a:extLst>
+                        <a:ext uri="{28A0092B-C50C-407E-A947-70E740481C1C}">
+                          <a14:useLocalDpi xmlns:a14="http://schemas.microsoft.com/office/drawing/2010/main"/>
+                        </a:ext>
+                      </a:extLst>
+                    </a:blip>
+                    <a:stretch>
+                      <a:fillRect/>
+                    </a:stretch>
+                  </pic:blipFill>
+                  <pic:spPr>
+                    <a:xfrm>
+                      <a:off x="0" y="0"/>
+                      <a:ext cx="4076700" cy="5943600"/>
+                    </a:xfrm>
+                    <a:prstGeom prst="rect">
+                      <a:avLst/>
+                    </a:prstGeom>
+                  </pic:spPr>
+                </pic:pic>
+              </a:graphicData>
+            </a:graphic>
+          </wp:inline>
+        </w:drawing>
+      </w:r>
+    </w:p>
+    <w:p>
+      <w:pPr>
+        <w:pStyle w:val="Normal"/>
+      </w:pPr>
+      <w:r>
+        <w:rPr>
+          <w:lang w:val="uk-UA"/>
+        </w:rPr>
+        <w:t>Текст програми:</w:t>
+      </w:r>
+      <w:r>
+        <w:drawing>
+          <wp:inline wp14:editId="041E0B9A" wp14:anchorId="57B871A2">
+            <wp:extent cx="5944430" cy="4706007"/>
+            <wp:effectExtent l="0" t="0" r="0" b="0"/>
+            <wp:docPr id="38318584" name="drawing"/>
+            <wp:cNvGraphicFramePr>
+              <a:graphicFrameLocks noChangeAspect="1"/>
+            </wp:cNvGraphicFramePr>
+            <a:graphic>
+              <a:graphicData xmlns:a="http://schemas.openxmlformats.org/drawingml/2006/main" uri="http://schemas.openxmlformats.org/drawingml/2006/picture">
+                <pic:pic xmlns:pic="http://schemas.openxmlformats.org/drawingml/2006/picture">
+                  <pic:nvPicPr>
+                    <pic:cNvPr id="38318584" name="Picture 38318584"/>
+                    <pic:cNvPicPr/>
+                  </pic:nvPicPr>
+                  <pic:blipFill>
+                    <a:blip xmlns:r="http://schemas.openxmlformats.org/officeDocument/2006/relationships" r:embed="rId888922530">
+                      <a:extLst>
+                        <a:ext uri="{28A0092B-C50C-407E-A947-70E740481C1C}">
+                          <a14:useLocalDpi xmlns:a14="http://schemas.microsoft.com/office/drawing/2010/main"/>
+                        </a:ext>
+                      </a:extLst>
+                    </a:blip>
+                    <a:stretch>
+                      <a:fillRect/>
+                    </a:stretch>
+                  </pic:blipFill>
+                  <pic:spPr>
+                    <a:xfrm>
+                      <a:off x="0" y="0"/>
+                      <a:ext cx="5944430" cy="4706007"/>
+                    </a:xfrm>
+                    <a:prstGeom prst="rect">
+                      <a:avLst/>
+                    </a:prstGeom>
+                  </pic:spPr>
+                </pic:pic>
+              </a:graphicData>
+            </a:graphic>
+          </wp:inline>
+        </w:drawing>
+      </w:r>
+      <w:r>
+        <w:tab/>
+      </w:r>
+      <w:r>
+        <w:rPr>
+          <w:lang w:val="uk-UA"/>
+        </w:rPr>
+        <w:t xml:space="preserve">Посилання на </w:t>
+      </w:r>
+      <w:r>
+        <w:rPr/>
+        <w:t>github</w:t>
+      </w:r>
+      <w:r>
+        <w:rPr>
+          <w:lang w:val="ru-RU"/>
+        </w:rPr>
+        <w:t>:</w:t>
+      </w:r>
+      <w:r>
+        <w:rPr>
+          <w:lang w:val="ru-RU"/>
+        </w:rPr>
+        <w:t xml:space="preserve"> </w:t>
+      </w:r>
+      <w:r>
+        <w:rPr>
+          <w:lang w:val="ru-RU"/>
+        </w:rPr>
+        <w:t>https://github.com/igor231083-cmd/TP-KB-251-Igor-Kharcenko/blob/main/Topic_05/functions.py</w:t>
+      </w:r>
+    </w:p>
+    <w:p>
+      <w:pPr>
+        <w:pStyle w:val="Normal"/>
+      </w:pPr>
+      <w:r>
+        <w:rPr>
+          <w:lang w:val="uk-UA"/>
+        </w:rPr>
+        <w:t xml:space="preserve">Знімок екрану з посилання на </w:t>
+      </w:r>
+      <w:r>
+        <w:rPr/>
+        <w:t>github</w:t>
+      </w:r>
+      <w:r>
+        <w:rPr/>
+        <w:t>:</w:t>
+      </w:r>
+      <w:r>
+        <w:drawing>
+          <wp:inline wp14:editId="61FAC882" wp14:anchorId="1DF36778">
+            <wp:extent cx="5106113" cy="5391902"/>
+            <wp:effectExtent l="0" t="0" r="0" b="0"/>
+            <wp:docPr id="1225720809" name="drawing"/>
+            <wp:cNvGraphicFramePr>
+              <a:graphicFrameLocks noChangeAspect="1"/>
+            </wp:cNvGraphicFramePr>
+            <a:graphic>
+              <a:graphicData xmlns:a="http://schemas.openxmlformats.org/drawingml/2006/main" uri="http://schemas.openxmlformats.org/drawingml/2006/picture">
+                <pic:pic xmlns:pic="http://schemas.openxmlformats.org/drawingml/2006/picture">
+                  <pic:nvPicPr>
+                    <pic:cNvPr id="1225720809" name="Picture 1225720809"/>
+                    <pic:cNvPicPr/>
+                  </pic:nvPicPr>
+                  <pic:blipFill>
+                    <a:blip xmlns:r="http://schemas.openxmlformats.org/officeDocument/2006/relationships" r:embed="rId14106016">
+                      <a:extLst>
+                        <a:ext uri="{28A0092B-C50C-407E-A947-70E740481C1C}">
+                          <a14:useLocalDpi xmlns:a14="http://schemas.microsoft.com/office/drawing/2010/main"/>
+                        </a:ext>
+                      </a:extLst>
+                    </a:blip>
+                    <a:stretch>
+                      <a:fillRect/>
+                    </a:stretch>
+                  </pic:blipFill>
+                  <pic:spPr>
+                    <a:xfrm>
+                      <a:off x="0" y="0"/>
+                      <a:ext cx="5106113" cy="5391902"/>
+                    </a:xfrm>
+                    <a:prstGeom prst="rect">
+                      <a:avLst/>
+                    </a:prstGeom>
+                  </pic:spPr>
+                </pic:pic>
+              </a:graphicData>
+            </a:graphic>
+          </wp:inline>
+        </w:drawing>
+      </w:r>
+    </w:p>
+    <w:p>
+      <w:pPr>
+        <w:pStyle w:val="Normal"/>
+      </w:pPr>
+      <w:r>
+        <w:rPr>
+          <w:lang w:val="uk-UA"/>
+        </w:rPr>
+        <w:t>Текст програми:</w:t>
+      </w:r>
+      <w:r>
+        <w:drawing>
+          <wp:inline wp14:editId="476A1CFF" wp14:anchorId="1D4D5F97">
+            <wp:extent cx="4591691" cy="3086531"/>
+            <wp:effectExtent l="0" t="0" r="0" b="0"/>
+            <wp:docPr id="1677350185" name="drawing"/>
+            <wp:cNvGraphicFramePr>
+              <a:graphicFrameLocks noChangeAspect="1"/>
+            </wp:cNvGraphicFramePr>
+            <a:graphic>
+              <a:graphicData xmlns:a="http://schemas.openxmlformats.org/drawingml/2006/main" uri="http://schemas.openxmlformats.org/drawingml/2006/picture">
+                <pic:pic xmlns:pic="http://schemas.openxmlformats.org/drawingml/2006/picture">
+                  <pic:nvPicPr>
+                    <pic:cNvPr id="1677350185" name="Picture 1677350185"/>
+                    <pic:cNvPicPr/>
+                  </pic:nvPicPr>
+                  <pic:blipFill>
+                    <a:blip xmlns:r="http://schemas.openxmlformats.org/officeDocument/2006/relationships" r:embed="rId1086312898">
+                      <a:extLst>
+                        <a:ext uri="{28A0092B-C50C-407E-A947-70E740481C1C}">
+                          <a14:useLocalDpi xmlns:a14="http://schemas.microsoft.com/office/drawing/2010/main"/>
+                        </a:ext>
+                      </a:extLst>
+                    </a:blip>
+                    <a:stretch>
+                      <a:fillRect/>
+                    </a:stretch>
+                  </pic:blipFill>
+                  <pic:spPr>
+                    <a:xfrm>
+                      <a:off x="0" y="0"/>
+                      <a:ext cx="4591691" cy="3086531"/>
+                    </a:xfrm>
+                    <a:prstGeom prst="rect">
+                      <a:avLst/>
+                    </a:prstGeom>
+                  </pic:spPr>
+                </pic:pic>
+              </a:graphicData>
+            </a:graphic>
+          </wp:inline>
+        </w:drawing>
+      </w:r>
+    </w:p>
+    <w:p>
+      <w:pPr>
+        <w:pStyle w:val="Normal"/>
+        <w:spacing w:before="240" w:beforeAutospacing="off" w:after="240" w:afterAutospacing="off" w:line="360" w:lineRule="auto"/>
+      </w:pPr>
+      <w:r>
+        <w:rPr>
+          <w:lang w:val="uk-UA"/>
+        </w:rPr>
+        <w:t xml:space="preserve">Посилання на </w:t>
+      </w:r>
+      <w:r>
+        <w:rPr/>
+        <w:t>github</w:t>
+      </w:r>
+      <w:r>
+        <w:rPr>
+          <w:lang w:val="ru-RU"/>
+        </w:rPr>
+        <w:t>:</w:t>
+      </w:r>
+      <w:r>
+        <w:rPr>
+          <w:lang w:val="ru-RU"/>
+        </w:rPr>
+        <w:t xml:space="preserve"> </w:t>
+      </w:r>
+      <w:r>
+        <w:rPr>
+          <w:lang w:val="ru-RU"/>
+        </w:rPr>
+        <w:t>https://github.com/igor231083-cmd/TP-KB-251-Igor-Kharcenko/blob/main/Topic_05/calc.py</w:t>
+      </w:r>
+    </w:p>
+    <w:p>
+      <w:pPr>
+        <w:pStyle w:val="Normal"/>
+      </w:pPr>
+      <w:r>
+        <w:rPr>
+          <w:lang w:val="uk-UA"/>
+        </w:rPr>
+        <w:t xml:space="preserve">Знімок екрану з посилання на </w:t>
+      </w:r>
+      <w:r>
+        <w:rPr/>
+        <w:t>github</w:t>
+      </w:r>
+      <w:r>
+        <w:rPr/>
+        <w:t>:</w:t>
+      </w:r>
+      <w:r>
+        <w:drawing>
+          <wp:inline wp14:editId="3AAADA68" wp14:anchorId="49654F4E">
+            <wp:extent cx="4439269" cy="3905795"/>
+            <wp:effectExtent l="0" t="0" r="0" b="0"/>
+            <wp:docPr id="778141462" name="drawing"/>
+            <wp:cNvGraphicFramePr>
+              <a:graphicFrameLocks noChangeAspect="1"/>
+            </wp:cNvGraphicFramePr>
+            <a:graphic>
+              <a:graphicData xmlns:a="http://schemas.openxmlformats.org/drawingml/2006/main" uri="http://schemas.openxmlformats.org/drawingml/2006/picture">
+                <pic:pic xmlns:pic="http://schemas.openxmlformats.org/drawingml/2006/picture">
+                  <pic:nvPicPr>
+                    <pic:cNvPr id="778141462" name="Picture 778141462"/>
+                    <pic:cNvPicPr/>
+                  </pic:nvPicPr>
+                  <pic:blipFill>
+                    <a:blip xmlns:r="http://schemas.openxmlformats.org/officeDocument/2006/relationships" r:embed="rId771246823">
+                      <a:extLst>
+                        <a:ext uri="{28A0092B-C50C-407E-A947-70E740481C1C}">
+                          <a14:useLocalDpi xmlns:a14="http://schemas.microsoft.com/office/drawing/2010/main"/>
+                        </a:ext>
+                      </a:extLst>
+                    </a:blip>
+                    <a:stretch>
+                      <a:fillRect/>
+                    </a:stretch>
+                  </pic:blipFill>
+                  <pic:spPr>
+                    <a:xfrm>
+                      <a:off x="0" y="0"/>
+                      <a:ext cx="4439269" cy="3905795"/>
+                    </a:xfrm>
+                    <a:prstGeom prst="rect">
+                      <a:avLst/>
+                    </a:prstGeom>
+                  </pic:spPr>
+                </pic:pic>
+              </a:graphicData>
+            </a:graphic>
+          </wp:inline>
+        </w:drawing>
+      </w:r>
+    </w:p>
+    <w:p>
+      <w:pPr>
+        <w:pStyle w:val="Normal"/>
+      </w:pPr>
+    </w:p>
+    <w:p>
+      <w:pPr>
+        <w:pStyle w:val="Normal"/>
         <w:spacing w:line="360" w:lineRule="auto"/>
         <w:jc w:val="both"/>
         <w:rPr>
@@ -7932,6 +12156,27 @@
       <w:u w:val="single"/>
     </w:rPr>
   </w:style>
+  <w:style w:type="paragraph" w:styleId="Heading2">
+    <w:uiPriority w:val="9"/>
+    <w:name w:val="heading 2"/>
+    <w:basedOn w:val="Normal"/>
+    <w:next w:val="Normal"/>
+    <w:unhideWhenUsed/>
+    <w:qFormat/>
+    <w:rsid w:val="0900AFF8"/>
+    <w:rPr>
+      <w:rFonts w:ascii="Calibri Light" w:hAnsi="Calibri Light" w:eastAsia="" w:cs="" w:asciiTheme="majorAscii" w:hAnsiTheme="majorAscii" w:eastAsiaTheme="majorEastAsia" w:cstheme="majorBidi"/>
+      <w:color w:val="2F5496" w:themeColor="accent1" w:themeTint="FF" w:themeShade="BF"/>
+      <w:sz w:val="32"/>
+      <w:szCs w:val="32"/>
+    </w:rPr>
+    <w:pPr>
+      <w:keepNext w:val="1"/>
+      <w:keepLines w:val="1"/>
+      <w:spacing w:before="160" w:after="80"/>
+      <w:outlineLvl w:val="1"/>
+    </w:pPr>
+  </w:style>
 </w:styles>
 </file>
 

</xml_diff>